<commit_message>
feat: roles y permisos configurables, versión 1.2.0
- Catálogo de permisos granulares (shared/constants/permisos.ts) aplicado en el main process
  por canal IPC; la UI solo los usa para mostrar u ocultar opciones.
- Nuevo módulo de roles (CRUD) administrable desde Configuración → Roles; el rol
  "Administrador" conserva todos los permisos y no es editable.
- El seed migra los roles con el formato antiguo de permisos al nuevo y siembra
  el rol "Vendedor" de ejemplo solo en la primera ejecución.
- Se quitan el eslogan y el mensaje de pie por defecto al migrar la configuración.
- La versión se toma de package.json y se muestra en el menú lateral.
- Se actualizan README y manual de usuario (docx/pdf).

Co-Authored-By: Claude Sonnet 5.5 <noreply@anthropic.com>
</commit_message>
<xml_diff>
--- a/docs/Manual-Usuario-NovaPOS.docx
+++ b/docs/Manual-Usuario-NovaPOS.docx
@@ -63,7 +63,7 @@
           <w:sz w:val="22"/>
           <w:szCs w:val="22"/>
         </w:rPr>
-        <w:t xml:space="preserve">Versión de la aplicación: 1.1.0</w:t>
+        <w:t xml:space="preserve">Versión de la aplicación: 1.2.0</w:t>
       </w:r>
     </w:p>
     <w:p>
@@ -404,7 +404,7 @@
         <w:spacing w:after="80"/>
       </w:pPr>
       <w:r>
-        <w:t xml:space="preserve">Controlar quién usa el sistema mediante usuarios y roles, con un registro de auditoría de los cambios importantes.</w:t>
+        <w:t xml:space="preserve">Controlar quién usa el sistema mediante usuarios y roles a medida, con permisos por función y un registro de auditoría de los cambios importantes.</w:t>
       </w:r>
     </w:p>
     <w:p>
@@ -497,7 +497,7 @@
         <w:t xml:space="preserve">Importante: </w:t>
       </w:r>
       <w:r>
-        <w:t xml:space="preserve">La primera vez que se instala NovaPOS, el sistema crea automáticamente un usuario administrador con usuario "admin" y contraseña "admin123". Inicia sesión con estos datos y cambia la contraseña de inmediato desde Configuración (ver sección 2.2), especialmente si varias personas usan el mismo computador.</w:t>
+        <w:t xml:space="preserve">La primera vez que se instala NovaPOS, el sistema crea automáticamente un usuario administrador con usuario "admin" y contraseña "admin123". Al iniciar sesión con esos datos, NovaPOS te obliga a elegir una contraseña nueva antes de continuar (ver sección 2.2); hasta entonces no podrás usar el resto de la aplicación.</w:t>
       </w:r>
     </w:p>
     <w:p>
@@ -552,7 +552,15 @@
         <w:spacing w:after="160"/>
       </w:pPr>
       <w:r>
-        <w:t xml:space="preserve">Si el usuario o la contraseña no son correctos, aparecerá un mensaje de error debajo del formulario. La sesión iniciada se mantiene mientras la aplicación esté abierta; al cerrarla o reiniciar el computador deberás iniciar sesión de nuevo.</w:t>
+        <w:t xml:space="preserve">Si el usuario o la contraseña no son correctos, aparecerá un mensaje de error debajo del formulario. Después de 5 intentos fallidos con el mismo usuario, el acceso se bloquea durante 5 minutos. La sesión iniciada se mantiene mientras la aplicación esté abierta; al cerrarla o reiniciar el computador deberás iniciar sesión de nuevo.</w:t>
+      </w:r>
+    </w:p>
+    <w:p>
+      <w:pPr>
+        <w:spacing w:after="160"/>
+      </w:pPr>
+      <w:r>
+        <w:t xml:space="preserve">Si entras con la contraseña inicial "admin123", NovaPOS muestra la pantalla "Cambia tu contraseña": escribe la contraseña actual, elige una nueva y presiona "Actualizar contraseña". También puedes cerrar sesión desde esa misma pantalla.</w:t>
       </w:r>
     </w:p>
     <w:p>
@@ -626,6 +634,14 @@
     </w:p>
     <w:p>
       <w:pPr>
+        <w:spacing w:after="160"/>
+      </w:pPr>
+      <w:r>
+        <w:t xml:space="preserve">La contraseña nueva debe tener al menos 6 caracteres y no puede ser "admin123" ni igual a la actual.</w:t>
+      </w:r>
+    </w:p>
+    <w:p>
+      <w:pPr>
         <w:pStyle w:val="Heading2"/>
         <w:spacing w:after="160" w:before="320"/>
       </w:pPr>
@@ -789,20 +805,28 @@
         <w:spacing w:after="80"/>
       </w:pPr>
       <w:r>
-        <w:t xml:space="preserve">Auditoría — historial de cambios (solo visible para usuarios con rol Administrador).</w:t>
-      </w:r>
-    </w:p>
-    <w:p>
-      <w:pPr>
-        <w:pStyle w:val="ListParagraph"/>
-        <w:numPr>
-          <w:ilvl w:val="0"/>
-          <w:numId w:val="2"/>
-        </w:numPr>
-        <w:spacing w:after="80"/>
-      </w:pPr>
-      <w:r>
-        <w:t xml:space="preserve">Configuración — datos del negocio, usuarios y sistema.</w:t>
+        <w:t xml:space="preserve">Auditoría — historial de cambios (solo para roles con permiso de auditoría).</w:t>
+      </w:r>
+    </w:p>
+    <w:p>
+      <w:pPr>
+        <w:pStyle w:val="ListParagraph"/>
+        <w:numPr>
+          <w:ilvl w:val="0"/>
+          <w:numId w:val="2"/>
+        </w:numPr>
+        <w:spacing w:after="80"/>
+      </w:pPr>
+      <w:r>
+        <w:t xml:space="preserve">Configuración — datos del negocio, usuarios, roles y sistema (según tus permisos).</w:t>
+      </w:r>
+    </w:p>
+    <w:p>
+      <w:pPr>
+        <w:spacing w:after="160"/>
+      </w:pPr>
+      <w:r>
+        <w:t xml:space="preserve">Cada usuario ve en el menú solo las secciones que su rol le permite usar. Si tu rol no incluye una sección, no aparecerá (ver capítulo 14).</w:t>
       </w:r>
     </w:p>
     <w:p>
@@ -1181,7 +1205,7 @@
         <w:spacing w:after="160"/>
       </w:pPr>
       <w:r>
-        <w:t xml:space="preserve">En cada fila de la tabla encontrarás dos íconos: un lápiz para editar y un cesto de basura para eliminar.</w:t>
+        <w:t xml:space="preserve">En cada fila de la tabla encontrarás dos íconos: un lápiz para editar y un cesto de basura para eliminar. Estos íconos, y el botón "Nuevo cliente", solo aparecen si tu rol tiene los permisos correspondientes (crear y editar clientes, eliminar clientes).</w:t>
       </w:r>
     </w:p>
     <w:p>
@@ -1437,177 +1461,6 @@
     </w:p>
     <w:p>
       <w:pPr>
-        <w:pStyle w:val="Heading2"/>
-        <w:spacing w:after="160" w:before="320"/>
-      </w:pPr>
-      <w:r>
-        <w:t xml:space="preserve">6.3 Eliminar un producto</w:t>
-      </w:r>
-    </w:p>
-    <w:p>
-      <w:pPr>
-        <w:spacing w:after="160"/>
-      </w:pPr>
-      <w:r>
-        <w:t xml:space="preserve">Si el producto no tiene ventas asociadas se elimina por completo; si ya se vendió alguna vez, se desactiva en lugar de eliminarse, para conservar el historial de esas ventas.</w:t>
-      </w:r>
-    </w:p>
-    <w:p>
-      <w:pPr>
-        <w:pStyle w:val="Heading1"/>
-        <w:spacing w:after="220" w:before="480"/>
-      </w:pPr>
-      <w:r>
-        <w:t xml:space="preserve">7. Ventas</w:t>
-      </w:r>
-    </w:p>
-    <w:p>
-      <w:pPr>
-        <w:spacing w:after="160"/>
-      </w:pPr>
-      <w:r>
-        <w:t xml:space="preserve">Este es el módulo que se usa para registrar una venta al mostrador. Al confirmar una venta, la aplicación descuenta el stock de los productos vendidos y genera la factura automáticamente, todo en un solo paso.</w:t>
-      </w:r>
-    </w:p>
-    <w:p>
-      <w:pPr>
-        <w:pStyle w:val="Heading2"/>
-        <w:spacing w:after="160" w:before="320"/>
-      </w:pPr>
-      <w:r>
-        <w:t xml:space="preserve">7.1 Elegir el cliente</w:t>
-      </w:r>
-    </w:p>
-    <w:p>
-      <w:pPr>
-        <w:spacing w:after="160"/>
-      </w:pPr>
-      <w:r>
-        <w:t xml:space="preserve">En la parte superior puedes buscar y seleccionar un cliente existente. Si no seleccionas ninguno, la venta queda registrada como "Consumidor final".</w:t>
-      </w:r>
-    </w:p>
-    <w:p>
-      <w:pPr>
-        <w:pStyle w:val="Heading2"/>
-        <w:spacing w:after="160" w:before="320"/>
-      </w:pPr>
-      <w:r>
-        <w:t xml:space="preserve">7.2 Tipo de venta: al detal o al por mayor</w:t>
-      </w:r>
-    </w:p>
-    <w:p>
-      <w:pPr>
-        <w:spacing w:after="160"/>
-      </w:pPr>
-      <w:r>
-        <w:t xml:space="preserve">Antes de agregar productos, elige si la venta es "Al detal" o "Al por mayor". Esto determina qué precio se toma de cada producto que agregues al carrito (si un producto no tiene precio al por mayor definido, se usará su precio al detal).</w:t>
-      </w:r>
-    </w:p>
-    <w:p>
-      <w:pPr>
-        <w:pStyle w:val="Heading2"/>
-        <w:spacing w:after="160" w:before="320"/>
-      </w:pPr>
-      <w:r>
-        <w:t xml:space="preserve">7.3 Agregar productos al carrito</w:t>
-      </w:r>
-    </w:p>
-    <w:p>
-      <w:pPr>
-        <w:spacing w:after="160"/>
-      </w:pPr>
-      <w:r>
-        <w:t xml:space="preserve">Usa el buscador de productos para encontrar el producto por nombre o código y agregarlo al carrito. En la tabla del carrito puedes ajustar la cantidad y el descuento de cada línea, o quitar un producto.</w:t>
-      </w:r>
-    </w:p>
-    <w:p>
-      <w:pPr>
-        <w:pStyle w:val="Heading2"/>
-        <w:spacing w:after="160" w:before="320"/>
-      </w:pPr>
-      <w:r>
-        <w:t xml:space="preserve">7.4 Descuentos y método de pago</w:t>
-      </w:r>
-    </w:p>
-    <w:p>
-      <w:pPr>
-        <w:spacing w:after="160"/>
-      </w:pPr>
-      <w:r>
-        <w:t xml:space="preserve">En el panel de pago, a la derecha, puedes:</w:t>
-      </w:r>
-    </w:p>
-    <w:p>
-      <w:pPr>
-        <w:pStyle w:val="ListParagraph"/>
-        <w:numPr>
-          <w:ilvl w:val="0"/>
-          <w:numId w:val="2"/>
-        </w:numPr>
-        <w:spacing w:after="80"/>
-      </w:pPr>
-      <w:r>
-        <w:t xml:space="preserve">Definir un descuento global adicional para toda la venta.</w:t>
-      </w:r>
-    </w:p>
-    <w:p>
-      <w:pPr>
-        <w:pStyle w:val="ListParagraph"/>
-        <w:numPr>
-          <w:ilvl w:val="0"/>
-          <w:numId w:val="2"/>
-        </w:numPr>
-        <w:spacing w:after="80"/>
-      </w:pPr>
-      <w:r>
-        <w:t xml:space="preserve">Revisar el resumen de subtotal, descuento y total.</w:t>
-      </w:r>
-    </w:p>
-    <w:p>
-      <w:pPr>
-        <w:pStyle w:val="ListParagraph"/>
-        <w:numPr>
-          <w:ilvl w:val="0"/>
-          <w:numId w:val="2"/>
-        </w:numPr>
-        <w:spacing w:after="80"/>
-      </w:pPr>
-      <w:r>
-        <w:t xml:space="preserve">Elegir el método de pago: Efectivo, Tarjeta, Transferencia o Mixto.</w:t>
-      </w:r>
-    </w:p>
-    <w:p>
-      <w:pPr>
-        <w:pStyle w:val="ListParagraph"/>
-        <w:numPr>
-          <w:ilvl w:val="0"/>
-          <w:numId w:val="2"/>
-        </w:numPr>
-        <w:spacing w:after="80"/>
-      </w:pPr>
-      <w:r>
-        <w:t xml:space="preserve">Si eliges "Mixto", indicar cuánto se paga en efectivo, tarjeta y transferencia (la suma debe coincidir con el total de la venta).</w:t>
-      </w:r>
-    </w:p>
-    <w:p>
-      <w:pPr>
-        <w:pStyle w:val="Heading2"/>
-        <w:spacing w:after="160" w:before="320"/>
-      </w:pPr>
-      <w:r>
-        <w:t xml:space="preserve">7.5 Confirmar la venta</w:t>
-      </w:r>
-    </w:p>
-    <w:p>
-      <w:pPr>
-        <w:spacing w:after="160"/>
-      </w:pPr>
-      <w:r>
-        <w:t xml:space="preserve">Al presionar "Confirmar venta", el sistema valida que haya stock suficiente de cada producto, descuenta el inventario, calcula los totales y genera la factura, mostrando una ventana de confirmación con el número de factura y dos botones: "Exportar PDF" e "Imprimir".</w:t>
-      </w:r>
-    </w:p>
-    <w:p>
-      <w:pPr>
         <w:pBdr>
           <w:left w:val="single" w:color="D97706" w:sz="18" w:space="8"/>
         </w:pBdr>
@@ -1623,7 +1476,24 @@
         <w:t xml:space="preserve">Importante: </w:t>
       </w:r>
       <w:r>
-        <w:t xml:space="preserve">Si el stock disponible de un producto es menor que la cantidad pedida en el carrito, la venta no se puede confirmar. Revisa el stock del producto desde el módulo Productos o Inventario.</w:t>
+        <w:t xml:space="preserve">Si tu rol no tiene el permiso de cambiar precios y stock, al editar un producto los campos de precios y stock aparecen bloqueados (solo lectura). El stock se ajusta desde el módulo Inventario, que deja registrado cada movimiento. Esta regla evita que se cambie un precio, se venda y se vuelva a cambiar sin dejar rastro.</w:t>
+      </w:r>
+    </w:p>
+    <w:p>
+      <w:pPr>
+        <w:pStyle w:val="Heading2"/>
+        <w:spacing w:after="160" w:before="320"/>
+      </w:pPr>
+      <w:r>
+        <w:t xml:space="preserve">6.3 Eliminar un producto</w:t>
+      </w:r>
+    </w:p>
+    <w:p>
+      <w:pPr>
+        <w:spacing w:after="160"/>
+      </w:pPr>
+      <w:r>
+        <w:t xml:space="preserve">Si el producto no tiene ventas asociadas se elimina por completo; si ya se vendió alguna vez, se desactiva en lugar de eliminarse, para conservar el historial de esas ventas. Eliminar productos requiere un permiso propio: si tu rol no lo tiene, el ícono no aparece.</w:t>
       </w:r>
     </w:p>
     <w:p>
@@ -1632,15 +1502,15 @@
         <w:spacing w:after="220" w:before="480"/>
       </w:pPr>
       <w:r>
-        <w:t xml:space="preserve">8. Facturas</w:t>
-      </w:r>
-    </w:p>
-    <w:p>
-      <w:pPr>
-        <w:spacing w:after="160"/>
-      </w:pPr>
-      <w:r>
-        <w:t xml:space="preserve">Cada venta genera automáticamente una factura con numeración consecutiva. En este módulo puedes consultar, filtrar, reimprimir y anular o eliminar el historial de facturas.</w:t>
+        <w:t xml:space="preserve">7. Ventas</w:t>
+      </w:r>
+    </w:p>
+    <w:p>
+      <w:pPr>
+        <w:spacing w:after="160"/>
+      </w:pPr>
+      <w:r>
+        <w:t xml:space="preserve">Este es el módulo que se usa para registrar una venta al mostrador. Al confirmar una venta, la aplicación descuenta el stock de los productos vendidos y genera la factura automáticamente, todo en un solo paso.</w:t>
       </w:r>
     </w:p>
     <w:p>
@@ -1649,15 +1519,15 @@
         <w:spacing w:after="160" w:before="320"/>
       </w:pPr>
       <w:r>
-        <w:t xml:space="preserve">8.1 Filtrar facturas</w:t>
-      </w:r>
-    </w:p>
-    <w:p>
-      <w:pPr>
-        <w:spacing w:after="160"/>
-      </w:pPr>
-      <w:r>
-        <w:t xml:space="preserve">Puedes filtrar por número de factura, nombre de producto, cliente, rango de fechas (desde/hasta) y método de pago, combinando los filtros que necesites.</w:t>
+        <w:t xml:space="preserve">7.1 Elegir el cliente</w:t>
+      </w:r>
+    </w:p>
+    <w:p>
+      <w:pPr>
+        <w:spacing w:after="160"/>
+      </w:pPr>
+      <w:r>
+        <w:t xml:space="preserve">En la parte superior puedes buscar y seleccionar un cliente existente. Si no seleccionas ninguno, la venta queda registrada como "Consumidor final".</w:t>
       </w:r>
     </w:p>
     <w:p>
@@ -1666,87 +1536,15 @@
         <w:spacing w:after="160" w:before="320"/>
       </w:pPr>
       <w:r>
-        <w:t xml:space="preserve">8.2 Acciones disponibles por factura</w:t>
-      </w:r>
-    </w:p>
-    <w:p>
-      <w:pPr>
-        <w:pStyle w:val="ListParagraph"/>
-        <w:numPr>
-          <w:ilvl w:val="0"/>
-          <w:numId w:val="2"/>
-        </w:numPr>
-        <w:spacing w:after="80"/>
-      </w:pPr>
-      <w:r>
-        <w:rPr>
-          <w:b/>
-          <w:bCs/>
-        </w:rPr>
-        <w:t xml:space="preserve">Ver / Imprimir (ícono de ojo): </w:t>
-      </w:r>
-      <w:r>
-        <w:t xml:space="preserve">abre el detalle de la factura con opción de imprimirla desde ahí.</w:t>
-      </w:r>
-    </w:p>
-    <w:p>
-      <w:pPr>
-        <w:pStyle w:val="ListParagraph"/>
-        <w:numPr>
-          <w:ilvl w:val="0"/>
-          <w:numId w:val="2"/>
-        </w:numPr>
-        <w:spacing w:after="80"/>
-      </w:pPr>
-      <w:r>
-        <w:rPr>
-          <w:b/>
-          <w:bCs/>
-        </w:rPr>
-        <w:t xml:space="preserve">Exportar PDF: </w:t>
-      </w:r>
-      <w:r>
-        <w:t xml:space="preserve">genera un archivo PDF de la factura para guardarlo o enviarlo.</w:t>
-      </w:r>
-    </w:p>
-    <w:p>
-      <w:pPr>
-        <w:pStyle w:val="ListParagraph"/>
-        <w:numPr>
-          <w:ilvl w:val="0"/>
-          <w:numId w:val="2"/>
-        </w:numPr>
-        <w:spacing w:after="80"/>
-      </w:pPr>
-      <w:r>
-        <w:rPr>
-          <w:b/>
-          <w:bCs/>
-        </w:rPr>
-        <w:t xml:space="preserve">Duplicar venta (ícono de copiar): </w:t>
-      </w:r>
-      <w:r>
-        <w:t xml:space="preserve">carga los mismos productos de esa venta en el carrito del módulo Ventas, ajustando automáticamente la cantidad si ya no hay stock suficiente, y te lleva a esa pantalla para confirmarla de nuevo.</w:t>
-      </w:r>
-    </w:p>
-    <w:p>
-      <w:pPr>
-        <w:pStyle w:val="ListParagraph"/>
-        <w:numPr>
-          <w:ilvl w:val="0"/>
-          <w:numId w:val="2"/>
-        </w:numPr>
-        <w:spacing w:after="80"/>
-      </w:pPr>
-      <w:r>
-        <w:rPr>
-          <w:b/>
-          <w:bCs/>
-        </w:rPr>
-        <w:t xml:space="preserve">Eliminar venta: </w:t>
-      </w:r>
-      <w:r>
-        <w:t xml:space="preserve">elimina la venta y su factura, y devuelve al inventario el stock de los productos vendidos. Esta acción no se puede deshacer.</w:t>
+        <w:t xml:space="preserve">7.2 Tipo de venta: al detal o al por mayor</w:t>
+      </w:r>
+    </w:p>
+    <w:p>
+      <w:pPr>
+        <w:spacing w:after="160"/>
+      </w:pPr>
+      <w:r>
+        <w:t xml:space="preserve">Antes de agregar productos, elige si la venta es "Al detal" o "Al por mayor". Esto determina qué precio se toma de cada producto que agregues al carrito (si un producto no tiene precio al por mayor definido, se usará su precio al detal).</w:t>
       </w:r>
     </w:p>
     <w:p>
@@ -1755,40 +1553,15 @@
         <w:spacing w:after="160" w:before="320"/>
       </w:pPr>
       <w:r>
-        <w:t xml:space="preserve">8.3 Imprimir facturas</w:t>
-      </w:r>
-    </w:p>
-    <w:p>
-      <w:pPr>
-        <w:spacing w:after="160"/>
-      </w:pPr>
-      <w:r>
-        <w:t xml:space="preserve">Al imprimir, si configuraste una impresora predeterminada en Configuración → Sistema, la factura se imprime directamente en esa impresora sin mostrar ningún cuadro de diálogo. Si no configuraste ninguna, se mostrará el diálogo de impresión del sistema operativo para que elijas la impresora manualmente (ver sección 12.3).</w:t>
-      </w:r>
-    </w:p>
-    <w:p>
-      <w:pPr>
-        <w:spacing w:after="160"/>
-      </w:pPr>
-      <w:r>
-        <w:t xml:space="preserve">Cada factura incluye código QR y código de barras, el logo y los datos del negocio configurados en Configuración → General.</w:t>
-      </w:r>
-    </w:p>
-    <w:p>
-      <w:pPr>
-        <w:pStyle w:val="Heading1"/>
-        <w:spacing w:after="220" w:before="480"/>
-      </w:pPr>
-      <w:r>
-        <w:t xml:space="preserve">9. Inventario</w:t>
-      </w:r>
-    </w:p>
-    <w:p>
-      <w:pPr>
-        <w:spacing w:after="160"/>
-      </w:pPr>
-      <w:r>
-        <w:t xml:space="preserve">El stock de cada producto se actualiza automáticamente con cada venta (se registra como una "salida") y con cada anulación de venta (se registra como una "entrada"). Además, desde este módulo puedes registrar movimientos manuales para reflejar situaciones que no vienen de una venta: mercancía que llega de un proveedor, salidas por daño o pérdida, o ajustes luego de un conteo físico del inventario.</w:t>
+        <w:t xml:space="preserve">7.3 Agregar productos al carrito</w:t>
+      </w:r>
+    </w:p>
+    <w:p>
+      <w:pPr>
+        <w:spacing w:after="160"/>
+      </w:pPr>
+      <w:r>
+        <w:t xml:space="preserve">Usa el buscador de productos para encontrar el producto por nombre o código y agregarlo al carrito. En la tabla del carrito puedes ajustar la cantidad y el descuento de cada línea, o quitar un producto. El precio no se escribe a mano: cada producto se vende al precio al detal o al por mayor que tiene guardado en Productos. Si el precio de un producto cambia mientras tienes el carrito abierto, NovaPOS lo detecta al confirmar y te pide quitarlo y volver a agregarlo.</w:t>
       </w:r>
     </w:p>
     <w:p>
@@ -1797,15 +1570,75 @@
         <w:spacing w:after="160" w:before="320"/>
       </w:pPr>
       <w:r>
-        <w:t xml:space="preserve">9.1 Historial de movimientos</w:t>
-      </w:r>
-    </w:p>
-    <w:p>
-      <w:pPr>
-        <w:spacing w:after="160"/>
-      </w:pPr>
-      <w:r>
-        <w:t xml:space="preserve">La tabla principal muestra todos los movimientos: fecha, producto, tipo (Entrada, Salida o Ajuste), cantidad, el stock antes y después del movimiento, y el motivo. Puedes filtrar por tipo de movimiento con el selector "Todos los tipos".</w:t>
+        <w:t xml:space="preserve">7.4 Descuentos y método de pago</w:t>
+      </w:r>
+    </w:p>
+    <w:p>
+      <w:pPr>
+        <w:spacing w:after="160"/>
+      </w:pPr>
+      <w:r>
+        <w:t xml:space="preserve">En el panel de pago, a la derecha, puedes:</w:t>
+      </w:r>
+    </w:p>
+    <w:p>
+      <w:pPr>
+        <w:pStyle w:val="ListParagraph"/>
+        <w:numPr>
+          <w:ilvl w:val="0"/>
+          <w:numId w:val="2"/>
+        </w:numPr>
+        <w:spacing w:after="80"/>
+      </w:pPr>
+      <w:r>
+        <w:t xml:space="preserve">Definir un descuento global adicional para toda la venta.</w:t>
+      </w:r>
+    </w:p>
+    <w:p>
+      <w:pPr>
+        <w:pStyle w:val="ListParagraph"/>
+        <w:numPr>
+          <w:ilvl w:val="0"/>
+          <w:numId w:val="2"/>
+        </w:numPr>
+        <w:spacing w:after="80"/>
+      </w:pPr>
+      <w:r>
+        <w:t xml:space="preserve">Revisar el resumen de subtotal, descuento y total; si el negocio tiene un porcentaje de IVA configurado, también se muestra el IVA incluido en el total.</w:t>
+      </w:r>
+    </w:p>
+    <w:p>
+      <w:pPr>
+        <w:pStyle w:val="ListParagraph"/>
+        <w:numPr>
+          <w:ilvl w:val="0"/>
+          <w:numId w:val="2"/>
+        </w:numPr>
+        <w:spacing w:after="80"/>
+      </w:pPr>
+      <w:r>
+        <w:t xml:space="preserve">Elegir el método de pago: Efectivo, Tarjeta, Transferencia o Mixto.</w:t>
+      </w:r>
+    </w:p>
+    <w:p>
+      <w:pPr>
+        <w:pStyle w:val="ListParagraph"/>
+        <w:numPr>
+          <w:ilvl w:val="0"/>
+          <w:numId w:val="2"/>
+        </w:numPr>
+        <w:spacing w:after="80"/>
+      </w:pPr>
+      <w:r>
+        <w:t xml:space="preserve">Si eliges "Mixto", indicar cuánto se paga en efectivo, tarjeta y transferencia (la suma de los tres montos no puede ser menor al total de la venta).</w:t>
+      </w:r>
+    </w:p>
+    <w:p>
+      <w:pPr>
+        <w:spacing w:after="160"/>
+      </w:pPr>
+      <w:r>
+        <w:t xml:space="preserve">El descuento de una línea no puede superar el valor de esa línea, ni el descuento global puede superar el total de la venta.</w:t>
       </w:r>
     </w:p>
     <w:p>
@@ -1814,103 +1647,15 @@
         <w:spacing w:after="160" w:before="320"/>
       </w:pPr>
       <w:r>
-        <w:t xml:space="preserve">9.2 Registrar un movimiento manual</w:t>
-      </w:r>
-    </w:p>
-    <w:p>
-      <w:pPr>
-        <w:spacing w:after="160"/>
-      </w:pPr>
-      <w:r>
-        <w:t xml:space="preserve">Presiona el botón "Registrar movimiento" y completa:</w:t>
-      </w:r>
-    </w:p>
-    <w:p>
-      <w:pPr>
-        <w:pStyle w:val="ListParagraph"/>
-        <w:numPr>
-          <w:ilvl w:val="0"/>
-          <w:numId w:val="2"/>
-        </w:numPr>
-        <w:spacing w:after="80"/>
-      </w:pPr>
-      <w:r>
-        <w:rPr>
-          <w:b/>
-          <w:bCs/>
-        </w:rPr>
-        <w:t xml:space="preserve">Producto: </w:t>
-      </w:r>
-      <w:r>
-        <w:t xml:space="preserve">búscalo por nombre o código; al seleccionarlo se muestra su stock actual.</w:t>
-      </w:r>
-    </w:p>
-    <w:p>
-      <w:pPr>
-        <w:pStyle w:val="ListParagraph"/>
-        <w:numPr>
-          <w:ilvl w:val="0"/>
-          <w:numId w:val="2"/>
-        </w:numPr>
-        <w:spacing w:after="80"/>
-      </w:pPr>
-      <w:r>
-        <w:rPr>
-          <w:b/>
-          <w:bCs/>
-        </w:rPr>
-        <w:t xml:space="preserve">Tipo de movimiento: </w:t>
-      </w:r>
-      <w:r>
-        <w:t xml:space="preserve">elige entre "Entrada de mercancía", "Salida manual" o "Ajuste por conteo físico".</w:t>
-      </w:r>
-    </w:p>
-    <w:p>
-      <w:pPr>
-        <w:pStyle w:val="ListParagraph"/>
-        <w:numPr>
-          <w:ilvl w:val="0"/>
-          <w:numId w:val="2"/>
-        </w:numPr>
-        <w:spacing w:after="80"/>
-      </w:pPr>
-      <w:r>
-        <w:rPr>
-          <w:b/>
-          <w:bCs/>
-        </w:rPr>
-        <w:t xml:space="preserve">Cantidad: </w:t>
-      </w:r>
-      <w:r>
-        <w:t xml:space="preserve">para entradas y salidas, la cantidad a sumar o restar del stock. Para un ajuste, en cambio, se indica el nuevo stock total que arrojó el conteo físico (el sistema calcula la diferencia automáticamente).</w:t>
-      </w:r>
-    </w:p>
-    <w:p>
-      <w:pPr>
-        <w:pStyle w:val="ListParagraph"/>
-        <w:numPr>
-          <w:ilvl w:val="0"/>
-          <w:numId w:val="2"/>
-        </w:numPr>
-        <w:spacing w:after="80"/>
-      </w:pPr>
-      <w:r>
-        <w:rPr>
-          <w:b/>
-          <w:bCs/>
-        </w:rPr>
-        <w:t xml:space="preserve">Motivo: </w:t>
-      </w:r>
-      <w:r>
-        <w:t xml:space="preserve">una breve descripción de la razón del movimiento (obligatorio).</w:t>
-      </w:r>
-    </w:p>
-    <w:p>
-      <w:pPr>
-        <w:spacing w:after="160"/>
-      </w:pPr>
-      <w:r>
-        <w:t xml:space="preserve">Al guardar, el stock del producto se actualiza de inmediato y el movimiento queda registrado en el historial.</w:t>
+        <w:t xml:space="preserve">7.5 Confirmar la venta</w:t>
+      </w:r>
+    </w:p>
+    <w:p>
+      <w:pPr>
+        <w:spacing w:after="160"/>
+      </w:pPr>
+      <w:r>
+        <w:t xml:space="preserve">Al presionar "Confirmar venta", el sistema valida que haya stock suficiente de cada producto, descuenta el inventario, calcula los totales y genera la factura, mostrando una ventana de confirmación con el número de factura y dos botones: "Exportar PDF" e "Imprimir".</w:t>
       </w:r>
     </w:p>
     <w:p>
@@ -1930,7 +1675,24 @@
         <w:t xml:space="preserve">Importante: </w:t>
       </w:r>
       <w:r>
-        <w:t xml:space="preserve">Una salida manual no puede dejar el stock en un número negativo: si la cantidad indicada supera el stock disponible, el sistema mostrará un mensaje de error y no registrará el movimiento.</w:t>
+        <w:t xml:space="preserve">Si el stock disponible de un producto es menor que la cantidad pedida en el carrito, la venta no se puede confirmar. Revisa el stock del producto desde el módulo Productos o Inventario.</w:t>
+      </w:r>
+    </w:p>
+    <w:p>
+      <w:pPr>
+        <w:pStyle w:val="Heading1"/>
+        <w:spacing w:after="220" w:before="480"/>
+      </w:pPr>
+      <w:r>
+        <w:t xml:space="preserve">8. Facturas</w:t>
+      </w:r>
+    </w:p>
+    <w:p>
+      <w:pPr>
+        <w:spacing w:after="160"/>
+      </w:pPr>
+      <w:r>
+        <w:t xml:space="preserve">Cada venta genera automáticamente una factura con numeración consecutiva. En este módulo puedes consultar, filtrar, reimprimir y anular facturas.</w:t>
       </w:r>
     </w:p>
     <w:p>
@@ -1939,15 +1701,129 @@
         <w:spacing w:after="160" w:before="320"/>
       </w:pPr>
       <w:r>
-        <w:t xml:space="preserve">9.3 Alertas de stock bajo</w:t>
-      </w:r>
-    </w:p>
-    <w:p>
-      <w:pPr>
-        <w:spacing w:after="160"/>
-      </w:pPr>
-      <w:r>
-        <w:t xml:space="preserve">En la parte superior del módulo se muestra un aviso cuando hay productos con stock igual o menor a su stock mínimo configurado, con los nombres de los primeros productos afectados.</w:t>
+        <w:t xml:space="preserve">8.1 Filtrar facturas</w:t>
+      </w:r>
+    </w:p>
+    <w:p>
+      <w:pPr>
+        <w:spacing w:after="160"/>
+      </w:pPr>
+      <w:r>
+        <w:t xml:space="preserve">Puedes filtrar por número de factura, nombre de producto, cliente, rango de fechas (desde/hasta) y método de pago, combinando los filtros que necesites.</w:t>
+      </w:r>
+    </w:p>
+    <w:p>
+      <w:pPr>
+        <w:pStyle w:val="Heading2"/>
+        <w:spacing w:after="160" w:before="320"/>
+      </w:pPr>
+      <w:r>
+        <w:t xml:space="preserve">8.2 Acciones disponibles por factura</w:t>
+      </w:r>
+    </w:p>
+    <w:p>
+      <w:pPr>
+        <w:pStyle w:val="ListParagraph"/>
+        <w:numPr>
+          <w:ilvl w:val="0"/>
+          <w:numId w:val="2"/>
+        </w:numPr>
+        <w:spacing w:after="80"/>
+      </w:pPr>
+      <w:r>
+        <w:rPr>
+          <w:b/>
+          <w:bCs/>
+        </w:rPr>
+        <w:t xml:space="preserve">Ver / Imprimir (ícono de ojo): </w:t>
+      </w:r>
+      <w:r>
+        <w:t xml:space="preserve">abre el detalle de la factura con opción de imprimirla desde ahí.</w:t>
+      </w:r>
+    </w:p>
+    <w:p>
+      <w:pPr>
+        <w:pStyle w:val="ListParagraph"/>
+        <w:numPr>
+          <w:ilvl w:val="0"/>
+          <w:numId w:val="2"/>
+        </w:numPr>
+        <w:spacing w:after="80"/>
+      </w:pPr>
+      <w:r>
+        <w:rPr>
+          <w:b/>
+          <w:bCs/>
+        </w:rPr>
+        <w:t xml:space="preserve">Exportar PDF: </w:t>
+      </w:r>
+      <w:r>
+        <w:t xml:space="preserve">genera un archivo PDF de la factura para guardarlo o enviarlo.</w:t>
+      </w:r>
+    </w:p>
+    <w:p>
+      <w:pPr>
+        <w:pStyle w:val="ListParagraph"/>
+        <w:numPr>
+          <w:ilvl w:val="0"/>
+          <w:numId w:val="2"/>
+        </w:numPr>
+        <w:spacing w:after="80"/>
+      </w:pPr>
+      <w:r>
+        <w:rPr>
+          <w:b/>
+          <w:bCs/>
+        </w:rPr>
+        <w:t xml:space="preserve">Duplicar venta (ícono de copiar): </w:t>
+      </w:r>
+      <w:r>
+        <w:t xml:space="preserve">carga los mismos productos de esa venta en el carrito del módulo Ventas, ajustando automáticamente la cantidad si ya no hay stock suficiente, y te lleva a esa pantalla para confirmarla de nuevo.</w:t>
+      </w:r>
+    </w:p>
+    <w:p>
+      <w:pPr>
+        <w:pStyle w:val="ListParagraph"/>
+        <w:numPr>
+          <w:ilvl w:val="0"/>
+          <w:numId w:val="2"/>
+        </w:numPr>
+        <w:spacing w:after="80"/>
+      </w:pPr>
+      <w:r>
+        <w:rPr>
+          <w:b/>
+          <w:bCs/>
+        </w:rPr>
+        <w:t xml:space="preserve">Anular venta (ícono de prohibido): </w:t>
+      </w:r>
+      <w:r>
+        <w:t xml:space="preserve">marca la factura como anulada y devuelve al inventario el stock de los productos vendidos. La factura no se borra: conserva su número consecutivo y queda en el historial con el estado "Anulada". Solo aparece si tu rol tiene el permiso de anular ventas y esta acción no se puede deshacer.</w:t>
+      </w:r>
+    </w:p>
+    <w:p>
+      <w:pPr>
+        <w:pStyle w:val="Heading2"/>
+        <w:spacing w:after="160" w:before="320"/>
+      </w:pPr>
+      <w:r>
+        <w:t xml:space="preserve">8.3 Imprimir facturas</w:t>
+      </w:r>
+    </w:p>
+    <w:p>
+      <w:pPr>
+        <w:spacing w:after="160"/>
+      </w:pPr>
+      <w:r>
+        <w:t xml:space="preserve">Al imprimir, si configuraste una impresora predeterminada en Configuración → Sistema, la factura se imprime directamente en esa impresora sin mostrar ningún cuadro de diálogo. Si no configuraste ninguna, se mostrará el diálogo de impresión del sistema operativo para que elijas la impresora manualmente (ver sección 12.3).</w:t>
+      </w:r>
+    </w:p>
+    <w:p>
+      <w:pPr>
+        <w:spacing w:after="160"/>
+      </w:pPr>
+      <w:r>
+        <w:t xml:space="preserve">Cada factura incluye código QR y código de barras, el logo y los datos del negocio configurados en Configuración → General. Si configuraste un porcentaje de IVA, la factura muestra además una fila "IVA incluido" con el valor del impuesto contenido en el total.</w:t>
       </w:r>
     </w:p>
     <w:p>
@@ -1956,15 +1832,15 @@
         <w:spacing w:after="220" w:before="480"/>
       </w:pPr>
       <w:r>
-        <w:t xml:space="preserve">10. Compras</w:t>
-      </w:r>
-    </w:p>
-    <w:p>
-      <w:pPr>
-        <w:spacing w:after="160"/>
-      </w:pPr>
-      <w:r>
-        <w:t xml:space="preserve">Este módulo permite registrar las facturas de compra que recibes de tus proveedores. Es un registro contable: no descuenta ni suma stock automáticamente (para eso existe el módulo Inventario, capítulo 9).</w:t>
+        <w:t xml:space="preserve">9. Inventario</w:t>
+      </w:r>
+    </w:p>
+    <w:p>
+      <w:pPr>
+        <w:spacing w:after="160"/>
+      </w:pPr>
+      <w:r>
+        <w:t xml:space="preserve">El stock de cada producto se actualiza automáticamente con cada venta (se registra como una "salida") y con cada anulación de venta (se registra como una "entrada"). Además, desde este módulo puedes registrar movimientos manuales para reflejar situaciones que no vienen de una venta: mercancía que llega de un proveedor, salidas por daño o pérdida, o ajustes luego de un conteo físico del inventario.</w:t>
       </w:r>
     </w:p>
     <w:p>
@@ -1973,135 +1849,15 @@
         <w:spacing w:after="160" w:before="320"/>
       </w:pPr>
       <w:r>
-        <w:t xml:space="preserve">10.1 Registrar una compra</w:t>
-      </w:r>
-    </w:p>
-    <w:p>
-      <w:pPr>
-        <w:spacing w:after="160"/>
-      </w:pPr>
-      <w:r>
-        <w:t xml:space="preserve">Presiona "Registrar compra" y completa:</w:t>
-      </w:r>
-    </w:p>
-    <w:p>
-      <w:pPr>
-        <w:pStyle w:val="ListParagraph"/>
-        <w:numPr>
-          <w:ilvl w:val="0"/>
-          <w:numId w:val="2"/>
-        </w:numPr>
-        <w:spacing w:after="80"/>
-      </w:pPr>
-      <w:r>
-        <w:rPr>
-          <w:b/>
-          <w:bCs/>
-        </w:rPr>
-        <w:t xml:space="preserve">Proveedor: </w:t>
-      </w:r>
-      <w:r>
-        <w:t xml:space="preserve">nombre del proveedor (obligatorio).</w:t>
-      </w:r>
-    </w:p>
-    <w:p>
-      <w:pPr>
-        <w:pStyle w:val="ListParagraph"/>
-        <w:numPr>
-          <w:ilvl w:val="0"/>
-          <w:numId w:val="2"/>
-        </w:numPr>
-        <w:spacing w:after="80"/>
-      </w:pPr>
-      <w:r>
-        <w:rPr>
-          <w:b/>
-          <w:bCs/>
-        </w:rPr>
-        <w:t xml:space="preserve">N.º de factura del proveedor: </w:t>
-      </w:r>
-      <w:r>
-        <w:t xml:space="preserve">número de referencia de la factura recibida (opcional).</w:t>
-      </w:r>
-    </w:p>
-    <w:p>
-      <w:pPr>
-        <w:pStyle w:val="ListParagraph"/>
-        <w:numPr>
-          <w:ilvl w:val="0"/>
-          <w:numId w:val="2"/>
-        </w:numPr>
-        <w:spacing w:after="80"/>
-      </w:pPr>
-      <w:r>
-        <w:rPr>
-          <w:b/>
-          <w:bCs/>
-        </w:rPr>
-        <w:t xml:space="preserve">Fecha: </w:t>
-      </w:r>
-      <w:r>
-        <w:t xml:space="preserve">fecha de la compra.</w:t>
-      </w:r>
-    </w:p>
-    <w:p>
-      <w:pPr>
-        <w:pStyle w:val="ListParagraph"/>
-        <w:numPr>
-          <w:ilvl w:val="0"/>
-          <w:numId w:val="2"/>
-        </w:numPr>
-        <w:spacing w:after="80"/>
-      </w:pPr>
-      <w:r>
-        <w:rPr>
-          <w:b/>
-          <w:bCs/>
-        </w:rPr>
-        <w:t xml:space="preserve">Método de pago: </w:t>
-      </w:r>
-      <w:r>
-        <w:t xml:space="preserve">efectivo, tarjeta o transferencia (opcional).</w:t>
-      </w:r>
-    </w:p>
-    <w:p>
-      <w:pPr>
-        <w:pStyle w:val="ListParagraph"/>
-        <w:numPr>
-          <w:ilvl w:val="0"/>
-          <w:numId w:val="2"/>
-        </w:numPr>
-        <w:spacing w:after="80"/>
-      </w:pPr>
-      <w:r>
-        <w:rPr>
-          <w:b/>
-          <w:bCs/>
-        </w:rPr>
-        <w:t xml:space="preserve">Ítems comprados: </w:t>
-      </w:r>
-      <w:r>
-        <w:t xml:space="preserve">agrega tantas líneas como productos o conceptos compraste, indicando descripción, cantidad y valor unitario. El total se calcula automáticamente.</w:t>
-      </w:r>
-    </w:p>
-    <w:p>
-      <w:pPr>
-        <w:pStyle w:val="ListParagraph"/>
-        <w:numPr>
-          <w:ilvl w:val="0"/>
-          <w:numId w:val="2"/>
-        </w:numPr>
-        <w:spacing w:after="80"/>
-      </w:pPr>
-      <w:r>
-        <w:rPr>
-          <w:b/>
-          <w:bCs/>
-        </w:rPr>
-        <w:t xml:space="preserve">Notas: </w:t>
-      </w:r>
-      <w:r>
-        <w:t xml:space="preserve">información adicional opcional.</w:t>
+        <w:t xml:space="preserve">9.1 Historial de movimientos</w:t>
+      </w:r>
+    </w:p>
+    <w:p>
+      <w:pPr>
+        <w:spacing w:after="160"/>
+      </w:pPr>
+      <w:r>
+        <w:t xml:space="preserve">La tabla principal muestra todos los movimientos: fecha, producto, tipo (Entrada, Salida o Ajuste), cantidad, el stock antes y después del movimiento, y el motivo. Puedes filtrar por tipo de movimiento con el selector "Todos los tipos".</w:t>
       </w:r>
     </w:p>
     <w:p>
@@ -2110,129 +1866,15 @@
         <w:spacing w:after="160" w:before="320"/>
       </w:pPr>
       <w:r>
-        <w:t xml:space="preserve">10.2 Consultar y eliminar compras</w:t>
-      </w:r>
-    </w:p>
-    <w:p>
-      <w:pPr>
-        <w:spacing w:after="160"/>
-      </w:pPr>
-      <w:r>
-        <w:t xml:space="preserve">Puedes filtrar el historial por nombre de proveedor, ver el detalle completo de una compra con el ícono de ojo, o eliminarla con el ícono de cesto de basura.</w:t>
-      </w:r>
-    </w:p>
-    <w:p>
-      <w:pPr>
-        <w:pStyle w:val="Heading1"/>
-        <w:spacing w:after="220" w:before="480"/>
-      </w:pPr>
-      <w:r>
-        <w:t xml:space="preserve">11. Reportes</w:t>
-      </w:r>
-    </w:p>
-    <w:p>
-      <w:pPr>
-        <w:spacing w:after="160"/>
-      </w:pPr>
-      <w:r>
-        <w:t xml:space="preserve">El módulo de Reportes permite analizar tus ventas y compras agrupándolas de distintas formas, con filtros combinables, y exportar el resultado a PDF, Excel o CSV. Tiene dos pestañas: "Ventas" y "Compras".</w:t>
-      </w:r>
-    </w:p>
-    <w:p>
-      <w:pPr>
-        <w:pStyle w:val="Heading2"/>
-        <w:spacing w:after="160" w:before="320"/>
-      </w:pPr>
-      <w:r>
-        <w:t xml:space="preserve">11.1 Reporte de ventas</w:t>
-      </w:r>
-    </w:p>
-    <w:p>
-      <w:pPr>
-        <w:spacing w:after="160"/>
-      </w:pPr>
-      <w:r>
-        <w:t xml:space="preserve">Filtros disponibles:</w:t>
-      </w:r>
-    </w:p>
-    <w:p>
-      <w:pPr>
-        <w:pStyle w:val="ListParagraph"/>
-        <w:numPr>
-          <w:ilvl w:val="0"/>
-          <w:numId w:val="2"/>
-        </w:numPr>
-        <w:spacing w:after="80"/>
-      </w:pPr>
-      <w:r>
-        <w:rPr>
-          <w:b/>
-          <w:bCs/>
-        </w:rPr>
-        <w:t xml:space="preserve">Desde / Hasta: </w:t>
-      </w:r>
-      <w:r>
-        <w:t xml:space="preserve">rango de fechas a analizar.</w:t>
-      </w:r>
-    </w:p>
-    <w:p>
-      <w:pPr>
-        <w:pStyle w:val="ListParagraph"/>
-        <w:numPr>
-          <w:ilvl w:val="0"/>
-          <w:numId w:val="2"/>
-        </w:numPr>
-        <w:spacing w:after="80"/>
-      </w:pPr>
-      <w:r>
-        <w:rPr>
-          <w:b/>
-          <w:bCs/>
-        </w:rPr>
-        <w:t xml:space="preserve">Agrupar por: </w:t>
-      </w:r>
-      <w:r>
-        <w:t xml:space="preserve">Día, Semana, Mes, Año, Cliente, Producto, Categoría o Método de pago.</w:t>
-      </w:r>
-    </w:p>
-    <w:p>
-      <w:pPr>
-        <w:pStyle w:val="ListParagraph"/>
-        <w:numPr>
-          <w:ilvl w:val="0"/>
-          <w:numId w:val="2"/>
-        </w:numPr>
-        <w:spacing w:after="80"/>
-      </w:pPr>
-      <w:r>
-        <w:rPr>
-          <w:b/>
-          <w:bCs/>
-        </w:rPr>
-        <w:t xml:space="preserve">Método de pago: </w:t>
-      </w:r>
-      <w:r>
-        <w:t xml:space="preserve">para analizar solo un método específico.</w:t>
-      </w:r>
-    </w:p>
-    <w:p>
-      <w:pPr>
-        <w:pStyle w:val="ListParagraph"/>
-        <w:numPr>
-          <w:ilvl w:val="0"/>
-          <w:numId w:val="2"/>
-        </w:numPr>
-        <w:spacing w:after="80"/>
-      </w:pPr>
-      <w:r>
-        <w:rPr>
-          <w:b/>
-          <w:bCs/>
-        </w:rPr>
-        <w:t xml:space="preserve">Cliente: </w:t>
-      </w:r>
-      <w:r>
-        <w:t xml:space="preserve">busca y selecciona un cliente puntual.</w:t>
+        <w:t xml:space="preserve">9.2 Registrar un movimiento manual</w:t>
+      </w:r>
+    </w:p>
+    <w:p>
+      <w:pPr>
+        <w:spacing w:after="160"/>
+      </w:pPr>
+      <w:r>
+        <w:t xml:space="preserve">Presiona el botón "Registrar movimiento" y completa:</w:t>
       </w:r>
     </w:p>
     <w:p>
@@ -2252,398 +1894,75 @@
         <w:t xml:space="preserve">Producto: </w:t>
       </w:r>
       <w:r>
-        <w:t xml:space="preserve">busca y selecciona un producto puntual.</w:t>
-      </w:r>
-    </w:p>
-    <w:p>
-      <w:pPr>
-        <w:pStyle w:val="ListParagraph"/>
-        <w:numPr>
-          <w:ilvl w:val="0"/>
-          <w:numId w:val="2"/>
-        </w:numPr>
-        <w:spacing w:after="80"/>
-      </w:pPr>
-      <w:r>
-        <w:rPr>
-          <w:b/>
-          <w:bCs/>
-        </w:rPr>
-        <w:t xml:space="preserve">Categoría: </w:t>
-      </w:r>
-      <w:r>
-        <w:t xml:space="preserve">filtra por una categoría de productos.</w:t>
-      </w:r>
-    </w:p>
-    <w:p>
-      <w:pPr>
-        <w:spacing w:after="160"/>
-      </w:pPr>
-      <w:r>
-        <w:t xml:space="preserve">El resultado muestra tarjetas con los totales generales (número de ventas, unidades vendidas, descuentos y total vendido) y una tabla con el detalle por cada grupo: número de ventas, unidades, subtotal, descuento y total.</w:t>
-      </w:r>
-    </w:p>
-    <w:p>
-      <w:pPr>
-        <w:pStyle w:val="Heading2"/>
-        <w:spacing w:after="160" w:before="320"/>
-      </w:pPr>
-      <w:r>
-        <w:t xml:space="preserve">11.2 Reporte de compras</w:t>
-      </w:r>
-    </w:p>
-    <w:p>
-      <w:pPr>
-        <w:spacing w:after="160"/>
-      </w:pPr>
-      <w:r>
-        <w:t xml:space="preserve">Funciona igual que el de ventas, pero agrupando por Día, Semana, Mes, Año o Proveedor, y filtrando opcionalmente por nombre de proveedor.</w:t>
-      </w:r>
-    </w:p>
-    <w:p>
-      <w:pPr>
-        <w:pStyle w:val="Heading2"/>
-        <w:spacing w:after="160" w:before="320"/>
-      </w:pPr>
-      <w:r>
-        <w:t xml:space="preserve">11.3 Exportar un reporte</w:t>
-      </w:r>
-    </w:p>
-    <w:p>
-      <w:pPr>
-        <w:spacing w:after="160"/>
-      </w:pPr>
-      <w:r>
-        <w:t xml:space="preserve">Elige el formato deseado en el selector "Formato" y presiona "Exportar":</w:t>
-      </w:r>
-    </w:p>
-    <w:p>
-      <w:pPr>
-        <w:pStyle w:val="ListParagraph"/>
-        <w:numPr>
-          <w:ilvl w:val="0"/>
-          <w:numId w:val="2"/>
-        </w:numPr>
-        <w:spacing w:after="80"/>
-      </w:pPr>
-      <w:r>
-        <w:rPr>
-          <w:b/>
-          <w:bCs/>
-        </w:rPr>
-        <w:t xml:space="preserve">PDF: </w:t>
-      </w:r>
-      <w:r>
-        <w:t xml:space="preserve">documento con el nombre del negocio, el período consultado y la tabla de resultados, listo para imprimir o compartir.</w:t>
-      </w:r>
-    </w:p>
-    <w:p>
-      <w:pPr>
-        <w:pStyle w:val="ListParagraph"/>
-        <w:numPr>
-          <w:ilvl w:val="0"/>
-          <w:numId w:val="2"/>
-        </w:numPr>
-        <w:spacing w:after="80"/>
-      </w:pPr>
-      <w:r>
-        <w:rPr>
-          <w:b/>
-          <w:bCs/>
-        </w:rPr>
-        <w:t xml:space="preserve">Excel (.xlsx): </w:t>
-      </w:r>
-      <w:r>
-        <w:t xml:space="preserve">hoja de cálculo editable con los mismos datos, útil para análisis adicionales.</w:t>
-      </w:r>
-    </w:p>
-    <w:p>
-      <w:pPr>
-        <w:pStyle w:val="ListParagraph"/>
-        <w:numPr>
-          <w:ilvl w:val="0"/>
-          <w:numId w:val="2"/>
-        </w:numPr>
-        <w:spacing w:after="80"/>
-      </w:pPr>
-      <w:r>
-        <w:rPr>
-          <w:b/>
-          <w:bCs/>
-        </w:rPr>
-        <w:t xml:space="preserve">CSV: </w:t>
-      </w:r>
-      <w:r>
-        <w:t xml:space="preserve">archivo de texto separado por comas, compatible con cualquier programa de hojas de cálculo.</w:t>
-      </w:r>
-    </w:p>
-    <w:p>
-      <w:pPr>
-        <w:spacing w:after="160"/>
-      </w:pPr>
-      <w:r>
-        <w:t xml:space="preserve">Al exportar se abrirá un cuadro para elegir dónde guardar el archivo en tu computador.</w:t>
-      </w:r>
-    </w:p>
-    <w:p>
-      <w:pPr>
-        <w:pStyle w:val="Heading1"/>
-        <w:spacing w:after="220" w:before="480"/>
-      </w:pPr>
-      <w:r>
-        <w:t xml:space="preserve">12. Configuración</w:t>
-      </w:r>
-    </w:p>
-    <w:p>
-      <w:pPr>
-        <w:spacing w:after="160"/>
-      </w:pPr>
-      <w:r>
-        <w:t xml:space="preserve">La pantalla de Configuración se organiza en pestañas. La pestaña "General" está disponible para todos los usuarios; las pestañas "Usuarios" y "Sistema" solo son visibles para usuarios con rol Administrador.</w:t>
-      </w:r>
-    </w:p>
-    <w:p>
-      <w:pPr>
-        <w:pStyle w:val="Heading2"/>
-        <w:spacing w:after="160" w:before="320"/>
-      </w:pPr>
-      <w:r>
-        <w:t xml:space="preserve">12.1 Pestaña General</w:t>
-      </w:r>
-    </w:p>
-    <w:p>
-      <w:pPr>
-        <w:spacing w:after="160"/>
-      </w:pPr>
-      <w:r>
-        <w:t xml:space="preserve">Datos del negocio, usados en las facturas y reportes:</w:t>
-      </w:r>
-    </w:p>
-    <w:p>
-      <w:pPr>
-        <w:pStyle w:val="ListParagraph"/>
-        <w:numPr>
-          <w:ilvl w:val="0"/>
-          <w:numId w:val="2"/>
-        </w:numPr>
-        <w:spacing w:after="80"/>
-      </w:pPr>
-      <w:r>
-        <w:rPr>
-          <w:b/>
-          <w:bCs/>
-        </w:rPr>
-        <w:t xml:space="preserve">Nombre comercial, NIT, teléfono, correo y dirección: </w:t>
-      </w:r>
-      <w:r>
-        <w:t xml:space="preserve">información de contacto del negocio.</w:t>
-      </w:r>
-    </w:p>
-    <w:p>
-      <w:pPr>
-        <w:pStyle w:val="ListParagraph"/>
-        <w:numPr>
-          <w:ilvl w:val="0"/>
-          <w:numId w:val="2"/>
-        </w:numPr>
-        <w:spacing w:after="80"/>
-      </w:pPr>
-      <w:r>
-        <w:rPr>
-          <w:b/>
-          <w:bCs/>
-        </w:rPr>
-        <w:t xml:space="preserve">Eslogan: </w:t>
-      </w:r>
-      <w:r>
-        <w:t xml:space="preserve">frase corta que aparece debajo del nombre en la factura.</w:t>
-      </w:r>
-    </w:p>
-    <w:p>
-      <w:pPr>
-        <w:pStyle w:val="ListParagraph"/>
-        <w:numPr>
-          <w:ilvl w:val="0"/>
-          <w:numId w:val="2"/>
-        </w:numPr>
-        <w:spacing w:after="80"/>
-      </w:pPr>
-      <w:r>
-        <w:rPr>
-          <w:b/>
-          <w:bCs/>
-        </w:rPr>
-        <w:t xml:space="preserve">Mensaje de pie de factura: </w:t>
-      </w:r>
-      <w:r>
-        <w:t xml:space="preserve">texto de despedida o invitación al final de la factura.</w:t>
-      </w:r>
-    </w:p>
-    <w:p>
-      <w:pPr>
-        <w:pStyle w:val="ListParagraph"/>
-        <w:numPr>
-          <w:ilvl w:val="0"/>
-          <w:numId w:val="2"/>
-        </w:numPr>
-        <w:spacing w:after="80"/>
-      </w:pPr>
-      <w:r>
-        <w:rPr>
-          <w:b/>
-          <w:bCs/>
-        </w:rPr>
-        <w:t xml:space="preserve">Moneda (ISO) y símbolo de moneda: </w:t>
-      </w:r>
-      <w:r>
-        <w:t xml:space="preserve">por ejemplo COP y "$".</w:t>
-      </w:r>
-    </w:p>
-    <w:p>
-      <w:pPr>
-        <w:pStyle w:val="ListParagraph"/>
-        <w:numPr>
-          <w:ilvl w:val="0"/>
-          <w:numId w:val="2"/>
-        </w:numPr>
-        <w:spacing w:after="80"/>
-      </w:pPr>
-      <w:r>
-        <w:rPr>
-          <w:b/>
-          <w:bCs/>
-        </w:rPr>
-        <w:t xml:space="preserve">Prefijo de factura y número inicial: </w:t>
-      </w:r>
-      <w:r>
-        <w:t xml:space="preserve">define cómo se numeran las facturas (por ejemplo, FAC-000001). El siguiente número a emitir se muestra como referencia.</w:t>
-      </w:r>
-    </w:p>
-    <w:p>
-      <w:pPr>
-        <w:pStyle w:val="ListParagraph"/>
-        <w:numPr>
-          <w:ilvl w:val="0"/>
-          <w:numId w:val="2"/>
-        </w:numPr>
-        <w:spacing w:after="80"/>
-      </w:pPr>
-      <w:r>
-        <w:rPr>
-          <w:b/>
-          <w:bCs/>
-        </w:rPr>
-        <w:t xml:space="preserve">Logo del negocio: </w:t>
-      </w:r>
-      <w:r>
-        <w:t xml:space="preserve">se puede seleccionar una imagen (PNG, JPG o SVG) que aparecerá en el menú lateral, en el login y en las facturas.</w:t>
-      </w:r>
-    </w:p>
-    <w:p>
-      <w:pPr>
-        <w:spacing w:after="160"/>
-      </w:pPr>
-      <w:r>
-        <w:t xml:space="preserve">Esta misma pestaña incluye la tarjeta "Cambiar mi contraseña" descrita en la sección 2.2.</w:t>
-      </w:r>
-    </w:p>
-    <w:p>
-      <w:pPr>
-        <w:pStyle w:val="Heading2"/>
-        <w:spacing w:after="160" w:before="320"/>
-      </w:pPr>
-      <w:r>
-        <w:t xml:space="preserve">12.2 Pestaña Usuarios (solo Administrador)</w:t>
-      </w:r>
-    </w:p>
-    <w:p>
-      <w:pPr>
-        <w:spacing w:after="160"/>
-      </w:pPr>
-      <w:r>
-        <w:t xml:space="preserve">Permite administrar quién puede entrar a NovaPOS y con qué rol.</w:t>
-      </w:r>
-    </w:p>
-    <w:p>
-      <w:pPr>
-        <w:pStyle w:val="Heading3"/>
-        <w:spacing w:after="120" w:before="220"/>
-      </w:pPr>
-      <w:r>
-        <w:t xml:space="preserve">Crear un usuario</w:t>
-      </w:r>
-    </w:p>
-    <w:p>
-      <w:pPr>
-        <w:pStyle w:val="ListParagraph"/>
-        <w:numPr>
-          <w:ilvl w:val="0"/>
-          <w:numId w:val="6"/>
-        </w:numPr>
-        <w:spacing w:after="80"/>
-      </w:pPr>
-      <w:r>
-        <w:t xml:space="preserve">Presiona "Nuevo usuario".</w:t>
-      </w:r>
-    </w:p>
-    <w:p>
-      <w:pPr>
-        <w:pStyle w:val="ListParagraph"/>
-        <w:numPr>
-          <w:ilvl w:val="0"/>
-          <w:numId w:val="6"/>
-        </w:numPr>
-        <w:spacing w:after="80"/>
-      </w:pPr>
-      <w:r>
-        <w:t xml:space="preserve">Completa el nombre completo, el nombre de usuario (sin espacios, se usa para iniciar sesión), el rol y una contraseña (mínimo 6 caracteres).</w:t>
-      </w:r>
-    </w:p>
-    <w:p>
-      <w:pPr>
-        <w:pStyle w:val="ListParagraph"/>
-        <w:numPr>
-          <w:ilvl w:val="0"/>
-          <w:numId w:val="6"/>
-        </w:numPr>
-        <w:spacing w:after="80"/>
-      </w:pPr>
-      <w:r>
-        <w:t xml:space="preserve">Presiona "Guardar".</w:t>
-      </w:r>
-    </w:p>
-    <w:p>
-      <w:pPr>
-        <w:pStyle w:val="Heading3"/>
-        <w:spacing w:after="120" w:before="220"/>
-      </w:pPr>
-      <w:r>
-        <w:t xml:space="preserve">Editar un usuario</w:t>
-      </w:r>
-    </w:p>
-    <w:p>
-      <w:pPr>
-        <w:spacing w:after="160"/>
-      </w:pPr>
-      <w:r>
-        <w:t xml:space="preserve">Al editar puedes cambiar el nombre, el usuario o el rol, y opcionalmente asignar una nueva contraseña dejando el campo vacío si no quieres cambiarla.</w:t>
-      </w:r>
-    </w:p>
-    <w:p>
-      <w:pPr>
-        <w:pStyle w:val="Heading3"/>
-        <w:spacing w:after="120" w:before="220"/>
-      </w:pPr>
-      <w:r>
-        <w:t xml:space="preserve">Eliminar o desactivar un usuario</w:t>
-      </w:r>
-    </w:p>
-    <w:p>
-      <w:pPr>
-        <w:spacing w:after="160"/>
-      </w:pPr>
-      <w:r>
-        <w:t xml:space="preserve">Si el usuario nunca ha registrado ventas, se elimina por completo; si ya registró ventas, se desactiva para conservar ese historial.</w:t>
+        <w:t xml:space="preserve">búscalo por nombre o código; al seleccionarlo se muestra su stock actual.</w:t>
+      </w:r>
+    </w:p>
+    <w:p>
+      <w:pPr>
+        <w:pStyle w:val="ListParagraph"/>
+        <w:numPr>
+          <w:ilvl w:val="0"/>
+          <w:numId w:val="2"/>
+        </w:numPr>
+        <w:spacing w:after="80"/>
+      </w:pPr>
+      <w:r>
+        <w:rPr>
+          <w:b/>
+          <w:bCs/>
+        </w:rPr>
+        <w:t xml:space="preserve">Tipo de movimiento: </w:t>
+      </w:r>
+      <w:r>
+        <w:t xml:space="preserve">elige entre "Entrada de mercancía", "Salida manual" o "Ajuste por conteo físico".</w:t>
+      </w:r>
+    </w:p>
+    <w:p>
+      <w:pPr>
+        <w:pStyle w:val="ListParagraph"/>
+        <w:numPr>
+          <w:ilvl w:val="0"/>
+          <w:numId w:val="2"/>
+        </w:numPr>
+        <w:spacing w:after="80"/>
+      </w:pPr>
+      <w:r>
+        <w:rPr>
+          <w:b/>
+          <w:bCs/>
+        </w:rPr>
+        <w:t xml:space="preserve">Cantidad: </w:t>
+      </w:r>
+      <w:r>
+        <w:t xml:space="preserve">para entradas y salidas, la cantidad a sumar o restar del stock. Para un ajuste, en cambio, se indica el nuevo stock total que arrojó el conteo físico (el sistema calcula la diferencia automáticamente).</w:t>
+      </w:r>
+    </w:p>
+    <w:p>
+      <w:pPr>
+        <w:pStyle w:val="ListParagraph"/>
+        <w:numPr>
+          <w:ilvl w:val="0"/>
+          <w:numId w:val="2"/>
+        </w:numPr>
+        <w:spacing w:after="80"/>
+      </w:pPr>
+      <w:r>
+        <w:rPr>
+          <w:b/>
+          <w:bCs/>
+        </w:rPr>
+        <w:t xml:space="preserve">Motivo: </w:t>
+      </w:r>
+      <w:r>
+        <w:t xml:space="preserve">una breve descripción de la razón del movimiento (obligatorio).</w:t>
+      </w:r>
+    </w:p>
+    <w:p>
+      <w:pPr>
+        <w:spacing w:after="160"/>
+      </w:pPr>
+      <w:r>
+        <w:t xml:space="preserve">Al guardar, el stock del producto se actualiza de inmediato y el movimiento queda registrado en el historial.</w:t>
       </w:r>
     </w:p>
     <w:p>
@@ -2663,7 +1982,15 @@
         <w:t xml:space="preserve">Importante: </w:t>
       </w:r>
       <w:r>
-        <w:t xml:space="preserve">El sistema no permite desactivar, eliminar o cambiar de rol al último usuario Administrador activo, para evitar quedarse sin acceso a la gestión del sistema.</w:t>
+        <w:t xml:space="preserve">Una salida manual no puede dejar el stock en un número negativo: si la cantidad indicada supera el stock disponible, el sistema mostrará un mensaje de error y no registrará el movimiento.</w:t>
+      </w:r>
+    </w:p>
+    <w:p>
+      <w:pPr>
+        <w:spacing w:after="160"/>
+      </w:pPr>
+      <w:r>
+        <w:t xml:space="preserve">Registrar movimientos manuales requiere el permiso de registrar entradas, salidas y ajustes; con solo el permiso de ver movimientos puedes consultar el historial, pero no crear nuevos.</w:t>
       </w:r>
     </w:p>
     <w:p>
@@ -2672,7 +1999,649 @@
         <w:spacing w:after="160" w:before="320"/>
       </w:pPr>
       <w:r>
-        <w:t xml:space="preserve">12.3 Pestaña Sistema (solo Administrador)</w:t>
+        <w:t xml:space="preserve">9.3 Alertas de stock bajo</w:t>
+      </w:r>
+    </w:p>
+    <w:p>
+      <w:pPr>
+        <w:spacing w:after="160"/>
+      </w:pPr>
+      <w:r>
+        <w:t xml:space="preserve">En la parte superior del módulo se muestra un aviso cuando hay productos con stock igual o menor a su stock mínimo configurado, con los nombres de los primeros productos afectados.</w:t>
+      </w:r>
+    </w:p>
+    <w:p>
+      <w:pPr>
+        <w:pStyle w:val="Heading1"/>
+        <w:spacing w:after="220" w:before="480"/>
+      </w:pPr>
+      <w:r>
+        <w:t xml:space="preserve">10. Compras</w:t>
+      </w:r>
+    </w:p>
+    <w:p>
+      <w:pPr>
+        <w:spacing w:after="160"/>
+      </w:pPr>
+      <w:r>
+        <w:t xml:space="preserve">Este módulo permite registrar las facturas de compra que recibes de tus proveedores. Es un registro contable: no descuenta ni suma stock automáticamente (para eso existe el módulo Inventario, capítulo 9).</w:t>
+      </w:r>
+    </w:p>
+    <w:p>
+      <w:pPr>
+        <w:pStyle w:val="Heading2"/>
+        <w:spacing w:after="160" w:before="320"/>
+      </w:pPr>
+      <w:r>
+        <w:t xml:space="preserve">10.1 Registrar una compra</w:t>
+      </w:r>
+    </w:p>
+    <w:p>
+      <w:pPr>
+        <w:spacing w:after="160"/>
+      </w:pPr>
+      <w:r>
+        <w:t xml:space="preserve">Presiona "Registrar compra" y completa:</w:t>
+      </w:r>
+    </w:p>
+    <w:p>
+      <w:pPr>
+        <w:pStyle w:val="ListParagraph"/>
+        <w:numPr>
+          <w:ilvl w:val="0"/>
+          <w:numId w:val="2"/>
+        </w:numPr>
+        <w:spacing w:after="80"/>
+      </w:pPr>
+      <w:r>
+        <w:rPr>
+          <w:b/>
+          <w:bCs/>
+        </w:rPr>
+        <w:t xml:space="preserve">Proveedor: </w:t>
+      </w:r>
+      <w:r>
+        <w:t xml:space="preserve">nombre del proveedor (obligatorio).</w:t>
+      </w:r>
+    </w:p>
+    <w:p>
+      <w:pPr>
+        <w:pStyle w:val="ListParagraph"/>
+        <w:numPr>
+          <w:ilvl w:val="0"/>
+          <w:numId w:val="2"/>
+        </w:numPr>
+        <w:spacing w:after="80"/>
+      </w:pPr>
+      <w:r>
+        <w:rPr>
+          <w:b/>
+          <w:bCs/>
+        </w:rPr>
+        <w:t xml:space="preserve">N.º de factura del proveedor: </w:t>
+      </w:r>
+      <w:r>
+        <w:t xml:space="preserve">número de referencia de la factura recibida (opcional).</w:t>
+      </w:r>
+    </w:p>
+    <w:p>
+      <w:pPr>
+        <w:pStyle w:val="ListParagraph"/>
+        <w:numPr>
+          <w:ilvl w:val="0"/>
+          <w:numId w:val="2"/>
+        </w:numPr>
+        <w:spacing w:after="80"/>
+      </w:pPr>
+      <w:r>
+        <w:rPr>
+          <w:b/>
+          <w:bCs/>
+        </w:rPr>
+        <w:t xml:space="preserve">Fecha: </w:t>
+      </w:r>
+      <w:r>
+        <w:t xml:space="preserve">fecha de la compra.</w:t>
+      </w:r>
+    </w:p>
+    <w:p>
+      <w:pPr>
+        <w:pStyle w:val="ListParagraph"/>
+        <w:numPr>
+          <w:ilvl w:val="0"/>
+          <w:numId w:val="2"/>
+        </w:numPr>
+        <w:spacing w:after="80"/>
+      </w:pPr>
+      <w:r>
+        <w:rPr>
+          <w:b/>
+          <w:bCs/>
+        </w:rPr>
+        <w:t xml:space="preserve">Método de pago: </w:t>
+      </w:r>
+      <w:r>
+        <w:t xml:space="preserve">efectivo, tarjeta o transferencia (opcional).</w:t>
+      </w:r>
+    </w:p>
+    <w:p>
+      <w:pPr>
+        <w:pStyle w:val="ListParagraph"/>
+        <w:numPr>
+          <w:ilvl w:val="0"/>
+          <w:numId w:val="2"/>
+        </w:numPr>
+        <w:spacing w:after="80"/>
+      </w:pPr>
+      <w:r>
+        <w:rPr>
+          <w:b/>
+          <w:bCs/>
+        </w:rPr>
+        <w:t xml:space="preserve">Ítems comprados: </w:t>
+      </w:r>
+      <w:r>
+        <w:t xml:space="preserve">agrega tantas líneas como productos o conceptos compraste, indicando descripción, cantidad y valor unitario. El total se calcula automáticamente.</w:t>
+      </w:r>
+    </w:p>
+    <w:p>
+      <w:pPr>
+        <w:pStyle w:val="ListParagraph"/>
+        <w:numPr>
+          <w:ilvl w:val="0"/>
+          <w:numId w:val="2"/>
+        </w:numPr>
+        <w:spacing w:after="80"/>
+      </w:pPr>
+      <w:r>
+        <w:rPr>
+          <w:b/>
+          <w:bCs/>
+        </w:rPr>
+        <w:t xml:space="preserve">Notas: </w:t>
+      </w:r>
+      <w:r>
+        <w:t xml:space="preserve">información adicional opcional.</w:t>
+      </w:r>
+    </w:p>
+    <w:p>
+      <w:pPr>
+        <w:pStyle w:val="Heading2"/>
+        <w:spacing w:after="160" w:before="320"/>
+      </w:pPr>
+      <w:r>
+        <w:t xml:space="preserve">10.2 Consultar y eliminar compras</w:t>
+      </w:r>
+    </w:p>
+    <w:p>
+      <w:pPr>
+        <w:spacing w:after="160"/>
+      </w:pPr>
+      <w:r>
+        <w:t xml:space="preserve">Puedes filtrar el historial por nombre de proveedor, ver el detalle completo de una compra con el ícono de ojo, o eliminarla con el ícono de cesto de basura. Ver, registrar y eliminar compras son permisos distintos: tu rol puede, por ejemplo, consultar compras sin poder crearlas ni borrarlas.</w:t>
+      </w:r>
+    </w:p>
+    <w:p>
+      <w:pPr>
+        <w:pStyle w:val="Heading1"/>
+        <w:spacing w:after="220" w:before="480"/>
+      </w:pPr>
+      <w:r>
+        <w:t xml:space="preserve">11. Reportes</w:t>
+      </w:r>
+    </w:p>
+    <w:p>
+      <w:pPr>
+        <w:spacing w:after="160"/>
+      </w:pPr>
+      <w:r>
+        <w:t xml:space="preserve">El módulo de Reportes permite analizar tus ventas y compras agrupándolas de distintas formas, con filtros combinables, y exportar el resultado a PDF, Excel o CSV. Tiene dos pestañas: "Ventas" y "Compras".</w:t>
+      </w:r>
+    </w:p>
+    <w:p>
+      <w:pPr>
+        <w:pStyle w:val="Heading2"/>
+        <w:spacing w:after="160" w:before="320"/>
+      </w:pPr>
+      <w:r>
+        <w:t xml:space="preserve">11.1 Reporte de ventas</w:t>
+      </w:r>
+    </w:p>
+    <w:p>
+      <w:pPr>
+        <w:spacing w:after="160"/>
+      </w:pPr>
+      <w:r>
+        <w:t xml:space="preserve">Filtros disponibles:</w:t>
+      </w:r>
+    </w:p>
+    <w:p>
+      <w:pPr>
+        <w:pStyle w:val="ListParagraph"/>
+        <w:numPr>
+          <w:ilvl w:val="0"/>
+          <w:numId w:val="2"/>
+        </w:numPr>
+        <w:spacing w:after="80"/>
+      </w:pPr>
+      <w:r>
+        <w:rPr>
+          <w:b/>
+          <w:bCs/>
+        </w:rPr>
+        <w:t xml:space="preserve">Desde / Hasta: </w:t>
+      </w:r>
+      <w:r>
+        <w:t xml:space="preserve">rango de fechas a analizar.</w:t>
+      </w:r>
+    </w:p>
+    <w:p>
+      <w:pPr>
+        <w:pStyle w:val="ListParagraph"/>
+        <w:numPr>
+          <w:ilvl w:val="0"/>
+          <w:numId w:val="2"/>
+        </w:numPr>
+        <w:spacing w:after="80"/>
+      </w:pPr>
+      <w:r>
+        <w:rPr>
+          <w:b/>
+          <w:bCs/>
+        </w:rPr>
+        <w:t xml:space="preserve">Agrupar por: </w:t>
+      </w:r>
+      <w:r>
+        <w:t xml:space="preserve">Día, Semana, Mes, Año, Cliente, Producto, Categoría o Método de pago.</w:t>
+      </w:r>
+    </w:p>
+    <w:p>
+      <w:pPr>
+        <w:pStyle w:val="ListParagraph"/>
+        <w:numPr>
+          <w:ilvl w:val="0"/>
+          <w:numId w:val="2"/>
+        </w:numPr>
+        <w:spacing w:after="80"/>
+      </w:pPr>
+      <w:r>
+        <w:rPr>
+          <w:b/>
+          <w:bCs/>
+        </w:rPr>
+        <w:t xml:space="preserve">Método de pago: </w:t>
+      </w:r>
+      <w:r>
+        <w:t xml:space="preserve">para analizar solo un método específico.</w:t>
+      </w:r>
+    </w:p>
+    <w:p>
+      <w:pPr>
+        <w:pStyle w:val="ListParagraph"/>
+        <w:numPr>
+          <w:ilvl w:val="0"/>
+          <w:numId w:val="2"/>
+        </w:numPr>
+        <w:spacing w:after="80"/>
+      </w:pPr>
+      <w:r>
+        <w:rPr>
+          <w:b/>
+          <w:bCs/>
+        </w:rPr>
+        <w:t xml:space="preserve">Cliente: </w:t>
+      </w:r>
+      <w:r>
+        <w:t xml:space="preserve">busca y selecciona un cliente puntual.</w:t>
+      </w:r>
+    </w:p>
+    <w:p>
+      <w:pPr>
+        <w:pStyle w:val="ListParagraph"/>
+        <w:numPr>
+          <w:ilvl w:val="0"/>
+          <w:numId w:val="2"/>
+        </w:numPr>
+        <w:spacing w:after="80"/>
+      </w:pPr>
+      <w:r>
+        <w:rPr>
+          <w:b/>
+          <w:bCs/>
+        </w:rPr>
+        <w:t xml:space="preserve">Producto: </w:t>
+      </w:r>
+      <w:r>
+        <w:t xml:space="preserve">busca y selecciona un producto puntual.</w:t>
+      </w:r>
+    </w:p>
+    <w:p>
+      <w:pPr>
+        <w:pStyle w:val="ListParagraph"/>
+        <w:numPr>
+          <w:ilvl w:val="0"/>
+          <w:numId w:val="2"/>
+        </w:numPr>
+        <w:spacing w:after="80"/>
+      </w:pPr>
+      <w:r>
+        <w:rPr>
+          <w:b/>
+          <w:bCs/>
+        </w:rPr>
+        <w:t xml:space="preserve">Categoría: </w:t>
+      </w:r>
+      <w:r>
+        <w:t xml:space="preserve">filtra por una categoría de productos.</w:t>
+      </w:r>
+    </w:p>
+    <w:p>
+      <w:pPr>
+        <w:spacing w:after="160"/>
+      </w:pPr>
+      <w:r>
+        <w:t xml:space="preserve">El resultado muestra tarjetas con los totales generales (número de ventas, unidades vendidas, descuentos y total vendido) y una tabla con el detalle por cada grupo: número de ventas, unidades, subtotal, descuento y total.</w:t>
+      </w:r>
+    </w:p>
+    <w:p>
+      <w:pPr>
+        <w:pStyle w:val="Heading2"/>
+        <w:spacing w:after="160" w:before="320"/>
+      </w:pPr>
+      <w:r>
+        <w:t xml:space="preserve">11.2 Reporte de compras</w:t>
+      </w:r>
+    </w:p>
+    <w:p>
+      <w:pPr>
+        <w:spacing w:after="160"/>
+      </w:pPr>
+      <w:r>
+        <w:t xml:space="preserve">Funciona igual que el de ventas, pero agrupando por Día, Semana, Mes, Año o Proveedor, y filtrando opcionalmente por nombre de proveedor.</w:t>
+      </w:r>
+    </w:p>
+    <w:p>
+      <w:pPr>
+        <w:pStyle w:val="Heading2"/>
+        <w:spacing w:after="160" w:before="320"/>
+      </w:pPr>
+      <w:r>
+        <w:t xml:space="preserve">11.3 Exportar un reporte</w:t>
+      </w:r>
+    </w:p>
+    <w:p>
+      <w:pPr>
+        <w:spacing w:after="160"/>
+      </w:pPr>
+      <w:r>
+        <w:t xml:space="preserve">Elige el formato deseado en el selector "Formato" y presiona "Exportar":</w:t>
+      </w:r>
+    </w:p>
+    <w:p>
+      <w:pPr>
+        <w:pStyle w:val="ListParagraph"/>
+        <w:numPr>
+          <w:ilvl w:val="0"/>
+          <w:numId w:val="2"/>
+        </w:numPr>
+        <w:spacing w:after="80"/>
+      </w:pPr>
+      <w:r>
+        <w:rPr>
+          <w:b/>
+          <w:bCs/>
+        </w:rPr>
+        <w:t xml:space="preserve">PDF: </w:t>
+      </w:r>
+      <w:r>
+        <w:t xml:space="preserve">documento con el nombre del negocio, el período consultado y la tabla de resultados, listo para imprimir o compartir.</w:t>
+      </w:r>
+    </w:p>
+    <w:p>
+      <w:pPr>
+        <w:pStyle w:val="ListParagraph"/>
+        <w:numPr>
+          <w:ilvl w:val="0"/>
+          <w:numId w:val="2"/>
+        </w:numPr>
+        <w:spacing w:after="80"/>
+      </w:pPr>
+      <w:r>
+        <w:rPr>
+          <w:b/>
+          <w:bCs/>
+        </w:rPr>
+        <w:t xml:space="preserve">Excel (.xlsx): </w:t>
+      </w:r>
+      <w:r>
+        <w:t xml:space="preserve">hoja de cálculo editable con los mismos datos, útil para análisis adicionales.</w:t>
+      </w:r>
+    </w:p>
+    <w:p>
+      <w:pPr>
+        <w:pStyle w:val="ListParagraph"/>
+        <w:numPr>
+          <w:ilvl w:val="0"/>
+          <w:numId w:val="2"/>
+        </w:numPr>
+        <w:spacing w:after="80"/>
+      </w:pPr>
+      <w:r>
+        <w:rPr>
+          <w:b/>
+          <w:bCs/>
+        </w:rPr>
+        <w:t xml:space="preserve">CSV: </w:t>
+      </w:r>
+      <w:r>
+        <w:t xml:space="preserve">archivo de texto separado por comas, compatible con cualquier programa de hojas de cálculo.</w:t>
+      </w:r>
+    </w:p>
+    <w:p>
+      <w:pPr>
+        <w:spacing w:after="160"/>
+      </w:pPr>
+      <w:r>
+        <w:t xml:space="preserve">Al exportar se abrirá un cuadro para elegir dónde guardar el archivo en tu computador.</w:t>
+      </w:r>
+    </w:p>
+    <w:p>
+      <w:pPr>
+        <w:pStyle w:val="Heading1"/>
+        <w:spacing w:after="220" w:before="480"/>
+      </w:pPr>
+      <w:r>
+        <w:t xml:space="preserve">12. Configuración</w:t>
+      </w:r>
+    </w:p>
+    <w:p>
+      <w:pPr>
+        <w:spacing w:after="160"/>
+      </w:pPr>
+      <w:r>
+        <w:t xml:space="preserve">La pantalla de Configuración se organiza en pestañas. La pestaña "General" está disponible para todos los usuarios (quien no puede editar la configuración del negocio solo ve la tarjeta para cambiar su contraseña). Las pestañas "Usuarios", "Roles" y "Sistema" aparecen según los permisos del rol: "Roles" es solo para el Administrador, "Usuarios" requiere el permiso de gestionar usuarios y "Sistema" el de copias de seguridad.</w:t>
+      </w:r>
+    </w:p>
+    <w:p>
+      <w:pPr>
+        <w:pStyle w:val="Heading2"/>
+        <w:spacing w:after="160" w:before="320"/>
+      </w:pPr>
+      <w:r>
+        <w:t xml:space="preserve">12.1 Pestaña General</w:t>
+      </w:r>
+    </w:p>
+    <w:p>
+      <w:pPr>
+        <w:spacing w:after="160"/>
+      </w:pPr>
+      <w:r>
+        <w:t xml:space="preserve">Datos del negocio, usados en las facturas y reportes:</w:t>
+      </w:r>
+    </w:p>
+    <w:p>
+      <w:pPr>
+        <w:pStyle w:val="ListParagraph"/>
+        <w:numPr>
+          <w:ilvl w:val="0"/>
+          <w:numId w:val="2"/>
+        </w:numPr>
+        <w:spacing w:after="80"/>
+      </w:pPr>
+      <w:r>
+        <w:rPr>
+          <w:b/>
+          <w:bCs/>
+        </w:rPr>
+        <w:t xml:space="preserve">Nombre comercial, NIT, teléfono, correo y dirección: </w:t>
+      </w:r>
+      <w:r>
+        <w:t xml:space="preserve">información de contacto del negocio.</w:t>
+      </w:r>
+    </w:p>
+    <w:p>
+      <w:pPr>
+        <w:pStyle w:val="ListParagraph"/>
+        <w:numPr>
+          <w:ilvl w:val="0"/>
+          <w:numId w:val="2"/>
+        </w:numPr>
+        <w:spacing w:after="80"/>
+      </w:pPr>
+      <w:r>
+        <w:rPr>
+          <w:b/>
+          <w:bCs/>
+        </w:rPr>
+        <w:t xml:space="preserve">Eslogan: </w:t>
+      </w:r>
+      <w:r>
+        <w:t xml:space="preserve">frase corta que aparece debajo del nombre en la factura.</w:t>
+      </w:r>
+    </w:p>
+    <w:p>
+      <w:pPr>
+        <w:pStyle w:val="ListParagraph"/>
+        <w:numPr>
+          <w:ilvl w:val="0"/>
+          <w:numId w:val="2"/>
+        </w:numPr>
+        <w:spacing w:after="80"/>
+      </w:pPr>
+      <w:r>
+        <w:rPr>
+          <w:b/>
+          <w:bCs/>
+        </w:rPr>
+        <w:t xml:space="preserve">Mensaje de pie de factura: </w:t>
+      </w:r>
+      <w:r>
+        <w:t xml:space="preserve">texto de despedida o invitación al final de la factura.</w:t>
+      </w:r>
+    </w:p>
+    <w:p>
+      <w:pPr>
+        <w:pStyle w:val="ListParagraph"/>
+        <w:numPr>
+          <w:ilvl w:val="0"/>
+          <w:numId w:val="2"/>
+        </w:numPr>
+        <w:spacing w:after="80"/>
+      </w:pPr>
+      <w:r>
+        <w:rPr>
+          <w:b/>
+          <w:bCs/>
+        </w:rPr>
+        <w:t xml:space="preserve">Moneda (ISO) y símbolo de moneda: </w:t>
+      </w:r>
+      <w:r>
+        <w:t xml:space="preserve">por ejemplo COP y "$".</w:t>
+      </w:r>
+    </w:p>
+    <w:p>
+      <w:pPr>
+        <w:pStyle w:val="ListParagraph"/>
+        <w:numPr>
+          <w:ilvl w:val="0"/>
+          <w:numId w:val="2"/>
+        </w:numPr>
+        <w:spacing w:after="80"/>
+      </w:pPr>
+      <w:r>
+        <w:rPr>
+          <w:b/>
+          <w:bCs/>
+        </w:rPr>
+        <w:t xml:space="preserve">Prefijo de factura y número inicial: </w:t>
+      </w:r>
+      <w:r>
+        <w:t xml:space="preserve">define cómo se numeran las facturas (por ejemplo, FAC-000001). El siguiente número a emitir se muestra como referencia.</w:t>
+      </w:r>
+    </w:p>
+    <w:p>
+      <w:pPr>
+        <w:pStyle w:val="ListParagraph"/>
+        <w:numPr>
+          <w:ilvl w:val="0"/>
+          <w:numId w:val="2"/>
+        </w:numPr>
+        <w:spacing w:after="80"/>
+      </w:pPr>
+      <w:r>
+        <w:rPr>
+          <w:b/>
+          <w:bCs/>
+        </w:rPr>
+        <w:t xml:space="preserve">IVA incluido en los precios (%): </w:t>
+      </w:r>
+      <w:r>
+        <w:t xml:space="preserve">porcentaje de IVA que ya viene incluido en los precios de venta. No suma nada al total: solo desglosa el IVA en la pantalla de ventas y en la factura. Usa 0 si no discriminas IVA (es el valor de una instalación nueva).</w:t>
+      </w:r>
+    </w:p>
+    <w:p>
+      <w:pPr>
+        <w:pStyle w:val="ListParagraph"/>
+        <w:numPr>
+          <w:ilvl w:val="0"/>
+          <w:numId w:val="2"/>
+        </w:numPr>
+        <w:spacing w:after="80"/>
+      </w:pPr>
+      <w:r>
+        <w:rPr>
+          <w:b/>
+          <w:bCs/>
+        </w:rPr>
+        <w:t xml:space="preserve">Logo del negocio: </w:t>
+      </w:r>
+      <w:r>
+        <w:t xml:space="preserve">se puede seleccionar una imagen (PNG, JPG o SVG) que aparecerá en el menú lateral, en el login y en las facturas.</w:t>
+      </w:r>
+    </w:p>
+    <w:p>
+      <w:pPr>
+        <w:spacing w:after="160"/>
+      </w:pPr>
+      <w:r>
+        <w:t xml:space="preserve">Esta misma pestaña incluye la tarjeta "Cambiar mi contraseña" descrita en la sección 2.2. Editar los datos del negocio requiere el permiso de editar la configuración; la tarjeta de contraseña está siempre disponible.</w:t>
+      </w:r>
+    </w:p>
+    <w:p>
+      <w:pPr>
+        <w:pStyle w:val="Heading2"/>
+        <w:spacing w:after="160" w:before="320"/>
+      </w:pPr>
+      <w:r>
+        <w:t xml:space="preserve">12.2 Pestaña Usuarios (requiere permiso)</w:t>
+      </w:r>
+    </w:p>
+    <w:p>
+      <w:pPr>
+        <w:spacing w:after="160"/>
+      </w:pPr>
+      <w:r>
+        <w:t xml:space="preserve">Permite administrar quién puede entrar a NovaPOS y con qué rol. Está disponible para el Administrador y para los roles con el permiso de crear y editar usuarios. Los roles disponibles para asignar son los que el Administrador define en la pestaña Roles (capítulo 14).</w:t>
       </w:r>
     </w:p>
     <w:p>
@@ -2681,55 +2650,80 @@
         <w:spacing w:after="120" w:before="220"/>
       </w:pPr>
       <w:r>
-        <w:t xml:space="preserve">Respaldos de la base de datos</w:t>
-      </w:r>
-    </w:p>
-    <w:p>
-      <w:pPr>
-        <w:spacing w:after="160"/>
-      </w:pPr>
-      <w:r>
-        <w:t xml:space="preserve">Se genera un respaldo automático al abrir la aplicación y cada 6 horas, conservando los últimos 20. Desde esta pestaña también puedes:</w:t>
-      </w:r>
-    </w:p>
-    <w:p>
-      <w:pPr>
-        <w:pStyle w:val="ListParagraph"/>
-        <w:numPr>
-          <w:ilvl w:val="0"/>
-          <w:numId w:val="2"/>
-        </w:numPr>
-        <w:spacing w:after="80"/>
-      </w:pPr>
-      <w:r>
-        <w:rPr>
-          <w:b/>
-          <w:bCs/>
-        </w:rPr>
-        <w:t xml:space="preserve">Crear backup ahora: </w:t>
-      </w:r>
-      <w:r>
-        <w:t xml:space="preserve">genera un respaldo manual en cualquier momento.</w:t>
-      </w:r>
-    </w:p>
-    <w:p>
-      <w:pPr>
-        <w:pStyle w:val="ListParagraph"/>
-        <w:numPr>
-          <w:ilvl w:val="0"/>
-          <w:numId w:val="2"/>
-        </w:numPr>
-        <w:spacing w:after="80"/>
-      </w:pPr>
-      <w:r>
-        <w:rPr>
-          <w:b/>
-          <w:bCs/>
-        </w:rPr>
-        <w:t xml:space="preserve">Restaurar: </w:t>
-      </w:r>
-      <w:r>
-        <w:t xml:space="preserve">reemplaza la base de datos actual por un respaldo anterior de la lista (se crea automáticamente un respaldo del estado actual antes de restaurar, por seguridad). Es necesario reiniciar la aplicación después de restaurar.</w:t>
+        <w:t xml:space="preserve">Crear un usuario</w:t>
+      </w:r>
+    </w:p>
+    <w:p>
+      <w:pPr>
+        <w:pStyle w:val="ListParagraph"/>
+        <w:numPr>
+          <w:ilvl w:val="0"/>
+          <w:numId w:val="6"/>
+        </w:numPr>
+        <w:spacing w:after="80"/>
+      </w:pPr>
+      <w:r>
+        <w:t xml:space="preserve">Presiona "Nuevo usuario".</w:t>
+      </w:r>
+    </w:p>
+    <w:p>
+      <w:pPr>
+        <w:pStyle w:val="ListParagraph"/>
+        <w:numPr>
+          <w:ilvl w:val="0"/>
+          <w:numId w:val="6"/>
+        </w:numPr>
+        <w:spacing w:after="80"/>
+      </w:pPr>
+      <w:r>
+        <w:t xml:space="preserve">Completa el nombre completo, el nombre de usuario (sin espacios, se usa para iniciar sesión), el rol y una contraseña (mínimo 6 caracteres).</w:t>
+      </w:r>
+    </w:p>
+    <w:p>
+      <w:pPr>
+        <w:pStyle w:val="ListParagraph"/>
+        <w:numPr>
+          <w:ilvl w:val="0"/>
+          <w:numId w:val="6"/>
+        </w:numPr>
+        <w:spacing w:after="80"/>
+      </w:pPr>
+      <w:r>
+        <w:t xml:space="preserve">Presiona "Guardar".</w:t>
+      </w:r>
+    </w:p>
+    <w:p>
+      <w:pPr>
+        <w:pStyle w:val="Heading3"/>
+        <w:spacing w:after="120" w:before="220"/>
+      </w:pPr>
+      <w:r>
+        <w:t xml:space="preserve">Editar un usuario</w:t>
+      </w:r>
+    </w:p>
+    <w:p>
+      <w:pPr>
+        <w:spacing w:after="160"/>
+      </w:pPr>
+      <w:r>
+        <w:t xml:space="preserve">Al editar puedes cambiar el nombre, el usuario o el rol, y opcionalmente asignar una nueva contraseña dejando el campo vacío si no quieres cambiarla. No puedes cambiar tu propio rol ni desactivar o eliminar tu propia cuenta.</w:t>
+      </w:r>
+    </w:p>
+    <w:p>
+      <w:pPr>
+        <w:pStyle w:val="Heading3"/>
+        <w:spacing w:after="120" w:before="220"/>
+      </w:pPr>
+      <w:r>
+        <w:t xml:space="preserve">Eliminar o desactivar un usuario</w:t>
+      </w:r>
+    </w:p>
+    <w:p>
+      <w:pPr>
+        <w:spacing w:after="160"/>
+      </w:pPr>
+      <w:r>
+        <w:t xml:space="preserve">Si el usuario nunca ha registrado ventas, se elimina por completo; si ya registró ventas, se desactiva para conservar ese historial.</w:t>
       </w:r>
     </w:p>
     <w:p>
@@ -2749,7 +2743,32 @@
         <w:t xml:space="preserve">Importante: </w:t>
       </w:r>
       <w:r>
-        <w:t xml:space="preserve">Restaurar un backup reemplaza todos los datos actuales por los del respaldo elegido. Úsalo solo cuando estés seguro de que es lo que necesitas.</w:t>
+        <w:t xml:space="preserve">El sistema no permite desactivar, eliminar o cambiar de rol al último usuario Administrador activo, para evitar quedarse sin acceso a la gestión del sistema.</w:t>
+      </w:r>
+    </w:p>
+    <w:p>
+      <w:pPr>
+        <w:spacing w:after="160"/>
+      </w:pPr>
+      <w:r>
+        <w:t xml:space="preserve">Un usuario que gestiona usuarios sin ser Administrador solo puede asignar roles con permisos que él mismo tiene, y no puede modificar cuentas de administradores (ver sección 14.4).</w:t>
+      </w:r>
+    </w:p>
+    <w:p>
+      <w:pPr>
+        <w:pStyle w:val="Heading2"/>
+        <w:spacing w:after="160" w:before="320"/>
+      </w:pPr>
+      <w:r>
+        <w:t xml:space="preserve">12.3 Pestaña Sistema (requiere permiso)</w:t>
+      </w:r>
+    </w:p>
+    <w:p>
+      <w:pPr>
+        <w:spacing w:after="160"/>
+      </w:pPr>
+      <w:r>
+        <w:t xml:space="preserve">Disponible para el Administrador y para los roles con el permiso de crear y restaurar copias de seguridad. La elección de la impresora predeterminada requiere además el permiso de editar la configuración del negocio.</w:t>
       </w:r>
     </w:p>
     <w:p>
@@ -2758,6 +2777,83 @@
         <w:spacing w:after="120" w:before="220"/>
       </w:pPr>
       <w:r>
+        <w:t xml:space="preserve">Respaldos de la base de datos</w:t>
+      </w:r>
+    </w:p>
+    <w:p>
+      <w:pPr>
+        <w:spacing w:after="160"/>
+      </w:pPr>
+      <w:r>
+        <w:t xml:space="preserve">Se genera un respaldo automático al abrir la aplicación y cada 6 horas, conservando los últimos 20. Desde esta pestaña también puedes:</w:t>
+      </w:r>
+    </w:p>
+    <w:p>
+      <w:pPr>
+        <w:pStyle w:val="ListParagraph"/>
+        <w:numPr>
+          <w:ilvl w:val="0"/>
+          <w:numId w:val="2"/>
+        </w:numPr>
+        <w:spacing w:after="80"/>
+      </w:pPr>
+      <w:r>
+        <w:rPr>
+          <w:b/>
+          <w:bCs/>
+        </w:rPr>
+        <w:t xml:space="preserve">Crear backup ahora: </w:t>
+      </w:r>
+      <w:r>
+        <w:t xml:space="preserve">genera un respaldo manual en cualquier momento.</w:t>
+      </w:r>
+    </w:p>
+    <w:p>
+      <w:pPr>
+        <w:pStyle w:val="ListParagraph"/>
+        <w:numPr>
+          <w:ilvl w:val="0"/>
+          <w:numId w:val="2"/>
+        </w:numPr>
+        <w:spacing w:after="80"/>
+      </w:pPr>
+      <w:r>
+        <w:rPr>
+          <w:b/>
+          <w:bCs/>
+        </w:rPr>
+        <w:t xml:space="preserve">Restaurar: </w:t>
+      </w:r>
+      <w:r>
+        <w:t xml:space="preserve">reemplaza la base de datos actual por un respaldo anterior de la lista (se crea automáticamente un respaldo del estado actual antes de restaurar, por seguridad). Es necesario reiniciar la aplicación después de restaurar.</w:t>
+      </w:r>
+    </w:p>
+    <w:p>
+      <w:pPr>
+        <w:pBdr>
+          <w:left w:val="single" w:color="D97706" w:sz="18" w:space="8"/>
+        </w:pBdr>
+        <w:shd w:fill="FEF3C7" w:color="auto" w:val="clear"/>
+        <w:spacing w:after="200" w:before="160"/>
+        <w:ind w:left="100"/>
+      </w:pPr>
+      <w:r>
+        <w:rPr>
+          <w:b/>
+          <w:bCs/>
+        </w:rPr>
+        <w:t xml:space="preserve">Importante: </w:t>
+      </w:r>
+      <w:r>
+        <w:t xml:space="preserve">Restaurar un backup reemplaza todos los datos actuales por los del respaldo elegido. Úsalo solo cuando estés seguro de que es lo que necesitas.</w:t>
+      </w:r>
+    </w:p>
+    <w:p>
+      <w:pPr>
+        <w:pStyle w:val="Heading3"/>
+        <w:spacing w:after="120" w:before="220"/>
+      </w:pPr>
+      <w:r>
         <w:t xml:space="preserve">Impresora predeterminada</w:t>
       </w:r>
     </w:p>
@@ -2767,6 +2863,23 @@
       </w:pPr>
       <w:r>
         <w:t xml:space="preserve">Muestra las impresoras detectadas en el computador. Al presionar "Usar esta" junto a una impresora, esa queda marcada como predeterminada y las facturas se imprimirán directamente en ella sin mostrar el diálogo de impresión del sistema (ver sección 8.3).</w:t>
+      </w:r>
+    </w:p>
+    <w:p>
+      <w:pPr>
+        <w:pStyle w:val="Heading2"/>
+        <w:spacing w:after="160" w:before="320"/>
+      </w:pPr>
+      <w:r>
+        <w:t xml:space="preserve">12.4 Pestaña Roles (solo Administrador)</w:t>
+      </w:r>
+    </w:p>
+    <w:p>
+      <w:pPr>
+        <w:spacing w:after="160"/>
+      </w:pPr>
+      <w:r>
+        <w:t xml:space="preserve">Aquí el Administrador crea, edita y elimina roles y define los permisos de cada uno. El procedimiento y la lista completa de permisos están en el capítulo 14.</w:t>
       </w:r>
     </w:p>
     <w:p>
@@ -2783,7 +2896,7 @@
         <w:spacing w:after="160"/>
       </w:pPr>
       <w:r>
-        <w:t xml:space="preserve">Este módulo, visible solo para usuarios con rol Administrador, muestra un historial de las creaciones, actualizaciones y eliminaciones realizadas en el sistema: productos, clientes, ventas, compras, configuración y usuarios.</w:t>
+        <w:t xml:space="preserve">Este módulo, visible para el Administrador y para los roles con el permiso de ver la auditoría, muestra un historial de las creaciones, actualizaciones y eliminaciones realizadas en el sistema: productos, clientes, ventas, compras, configuración, usuarios y roles.</w:t>
       </w:r>
     </w:p>
     <w:p>
@@ -2792,6 +2905,14 @@
       </w:pPr>
       <w:r>
         <w:t xml:space="preserve">Cada registro indica la fecha, el usuario que hizo el cambio (o "Sistema" si no hay un usuario asociado), la entidad afectada (por ejemplo "producto" o "venta"), el identificador de ese registro, el tipo de acción (Creación, Actualización o Eliminación) y un detalle breve.</w:t>
+      </w:r>
+    </w:p>
+    <w:p>
+      <w:pPr>
+        <w:spacing w:after="160"/>
+      </w:pPr>
+      <w:r>
+        <w:t xml:space="preserve">En los cambios de productos, el detalle incluye el valor anterior y el nuevo de cada campo sensible (precios, stock, código, nombre y estado), así que puedes saber quién cambió un precio y cuándo.</w:t>
       </w:r>
     </w:p>
     <w:p>
@@ -2836,7 +2957,56 @@
         <w:spacing w:after="160"/>
       </w:pPr>
       <w:r>
-        <w:t xml:space="preserve">NovaPOS incluye dos roles predefinidos:</w:t>
+        <w:t xml:space="preserve">Cada usuario tiene un rol y cada rol define qué puede hacer. NovaPOS trae dos roles listos para usar, y el Administrador puede crear todos los demás que necesite (por ejemplo Cajero, Bodeguero o Contador) eligiendo exactamente los permisos de cada uno.</w:t>
+      </w:r>
+    </w:p>
+    <w:p>
+      <w:pPr>
+        <w:pStyle w:val="Heading2"/>
+        <w:spacing w:after="160" w:before="320"/>
+      </w:pPr>
+      <w:r>
+        <w:t xml:space="preserve">14.1 Roles predefinidos</w:t>
+      </w:r>
+    </w:p>
+    <w:p>
+      <w:pPr>
+        <w:pStyle w:val="ListParagraph"/>
+        <w:numPr>
+          <w:ilvl w:val="0"/>
+          <w:numId w:val="2"/>
+        </w:numPr>
+        <w:spacing w:after="80"/>
+      </w:pPr>
+      <w:r>
+        <w:rPr>
+          <w:b/>
+          <w:bCs/>
+        </w:rPr>
+        <w:t xml:space="preserve">Administrador: </w:t>
+      </w:r>
+      <w:r>
+        <w:t xml:space="preserve">tiene todos los permisos, siempre. Es un rol del sistema: no se puede modificar ni eliminar.</w:t>
+      </w:r>
+    </w:p>
+    <w:p>
+      <w:pPr>
+        <w:pStyle w:val="ListParagraph"/>
+        <w:numPr>
+          <w:ilvl w:val="0"/>
+          <w:numId w:val="2"/>
+        </w:numPr>
+        <w:spacing w:after="80"/>
+      </w:pPr>
+      <w:r>
+        <w:rPr>
+          <w:b/>
+          <w:bCs/>
+        </w:rPr>
+        <w:t xml:space="preserve">Vendedor: </w:t>
+      </w:r>
+      <w:r>
+        <w:t xml:space="preserve">rol de ejemplo para atender la caja. Se puede editar o eliminar (si no tiene usuarios) como cualquier rol creado por ti. La tabla muestra lo que permite en una instalación nueva.</w:t>
       </w:r>
     </w:p>
     <w:tbl>
@@ -2852,9 +3022,9 @@
         </w:tblBorders>
       </w:tblPr>
       <w:tblGrid>
-        <w:gridCol w:w="4600"/>
-        <w:gridCol w:w="2400"/>
-        <w:gridCol w:w="2400"/>
+        <w:gridCol w:w="5000"/>
+        <w:gridCol w:w="2200"/>
+        <w:gridCol w:w="2200"/>
       </w:tblGrid>
       <w:tr>
         <w:trPr>
@@ -2862,7 +3032,7 @@
         </w:trPr>
         <w:tc>
           <w:tcPr>
-            <w:tcW w:type="dxa" w:w="4600"/>
+            <w:tcW w:type="dxa" w:w="5000"/>
             <w:shd w:fill="4F46E5" w:val="clear"/>
             <w:tcMar>
               <w:top w:type="dxa" w:w="80"/>
@@ -2879,13 +3049,13 @@
                 <w:bCs/>
                 <w:color w:val="FFFFFF"/>
               </w:rPr>
-              <w:t xml:space="preserve">Sección</w:t>
-            </w:r>
-          </w:p>
-        </w:tc>
-        <w:tc>
-          <w:tcPr>
-            <w:tcW w:type="dxa" w:w="2400"/>
+              <w:t xml:space="preserve">Función</w:t>
+            </w:r>
+          </w:p>
+        </w:tc>
+        <w:tc>
+          <w:tcPr>
+            <w:tcW w:type="dxa" w:w="2200"/>
             <w:shd w:fill="4F46E5" w:val="clear"/>
             <w:tcMar>
               <w:top w:type="dxa" w:w="80"/>
@@ -2908,7 +3078,7 @@
         </w:tc>
         <w:tc>
           <w:tcPr>
-            <w:tcW w:type="dxa" w:w="2400"/>
+            <w:tcW w:type="dxa" w:w="2200"/>
             <w:shd w:fill="4F46E5" w:val="clear"/>
             <w:tcMar>
               <w:top w:type="dxa" w:w="80"/>
@@ -2933,23 +3103,23 @@
       <w:tr>
         <w:tc>
           <w:tcPr>
-            <w:tcW w:type="dxa" w:w="4600"/>
-            <w:tcMar>
-              <w:top w:type="dxa" w:w="80"/>
-              <w:left w:type="dxa" w:w="120"/>
-              <w:bottom w:type="dxa" w:w="80"/>
-              <w:right w:type="dxa" w:w="120"/>
-            </w:tcMar>
-          </w:tcPr>
-          <w:p>
-            <w:r>
-              <w:t xml:space="preserve">Dashboard, Ventas, Facturas, Productos, Clientes, Inventario, Compras, Reportes</w:t>
-            </w:r>
-          </w:p>
-        </w:tc>
-        <w:tc>
-          <w:tcPr>
-            <w:tcW w:type="dxa" w:w="2400"/>
+            <w:tcW w:type="dxa" w:w="5000"/>
+            <w:tcMar>
+              <w:top w:type="dxa" w:w="80"/>
+              <w:left w:type="dxa" w:w="120"/>
+              <w:bottom w:type="dxa" w:w="80"/>
+              <w:right w:type="dxa" w:w="120"/>
+            </w:tcMar>
+          </w:tcPr>
+          <w:p>
+            <w:r>
+              <w:t xml:space="preserve">Registrar ventas, consultar facturas, ver Dashboard y Reportes</w:t>
+            </w:r>
+          </w:p>
+        </w:tc>
+        <w:tc>
+          <w:tcPr>
+            <w:tcW w:type="dxa" w:w="2200"/>
             <w:tcMar>
               <w:top w:type="dxa" w:w="80"/>
               <w:left w:type="dxa" w:w="120"/>
@@ -2965,7 +3135,7 @@
         </w:tc>
         <w:tc>
           <w:tcPr>
-            <w:tcW w:type="dxa" w:w="2400"/>
+            <w:tcW w:type="dxa" w:w="2200"/>
             <w:tcMar>
               <w:top w:type="dxa" w:w="80"/>
               <w:left w:type="dxa" w:w="120"/>
@@ -2983,23 +3153,23 @@
       <w:tr>
         <w:tc>
           <w:tcPr>
-            <w:tcW w:type="dxa" w:w="4600"/>
-            <w:tcMar>
-              <w:top w:type="dxa" w:w="80"/>
-              <w:left w:type="dxa" w:w="120"/>
-              <w:bottom w:type="dxa" w:w="80"/>
-              <w:right w:type="dxa" w:w="120"/>
-            </w:tcMar>
-          </w:tcPr>
-          <w:p>
-            <w:r>
-              <w:t xml:space="preserve">Configuración → General (datos del negocio, cambiar mi contraseña)</w:t>
-            </w:r>
-          </w:p>
-        </w:tc>
-        <w:tc>
-          <w:tcPr>
-            <w:tcW w:type="dxa" w:w="2400"/>
+            <w:tcW w:type="dxa" w:w="5000"/>
+            <w:tcMar>
+              <w:top w:type="dxa" w:w="80"/>
+              <w:left w:type="dxa" w:w="120"/>
+              <w:bottom w:type="dxa" w:w="80"/>
+              <w:right w:type="dxa" w:w="120"/>
+            </w:tcMar>
+          </w:tcPr>
+          <w:p>
+            <w:r>
+              <w:t xml:space="preserve">Crear y editar productos y clientes</w:t>
+            </w:r>
+          </w:p>
+        </w:tc>
+        <w:tc>
+          <w:tcPr>
+            <w:tcW w:type="dxa" w:w="2200"/>
             <w:tcMar>
               <w:top w:type="dxa" w:w="80"/>
               <w:left w:type="dxa" w:w="120"/>
@@ -3015,7 +3185,7 @@
         </w:tc>
         <w:tc>
           <w:tcPr>
-            <w:tcW w:type="dxa" w:w="2400"/>
+            <w:tcW w:type="dxa" w:w="2200"/>
             <w:tcMar>
               <w:top w:type="dxa" w:w="80"/>
               <w:left w:type="dxa" w:w="120"/>
@@ -3033,23 +3203,23 @@
       <w:tr>
         <w:tc>
           <w:tcPr>
-            <w:tcW w:type="dxa" w:w="4600"/>
-            <w:tcMar>
-              <w:top w:type="dxa" w:w="80"/>
-              <w:left w:type="dxa" w:w="120"/>
-              <w:bottom w:type="dxa" w:w="80"/>
-              <w:right w:type="dxa" w:w="120"/>
-            </w:tcMar>
-          </w:tcPr>
-          <w:p>
-            <w:r>
-              <w:t xml:space="preserve">Configuración → Usuarios</w:t>
-            </w:r>
-          </w:p>
-        </w:tc>
-        <w:tc>
-          <w:tcPr>
-            <w:tcW w:type="dxa" w:w="2400"/>
+            <w:tcW w:type="dxa" w:w="5000"/>
+            <w:tcMar>
+              <w:top w:type="dxa" w:w="80"/>
+              <w:left w:type="dxa" w:w="120"/>
+              <w:bottom w:type="dxa" w:w="80"/>
+              <w:right w:type="dxa" w:w="120"/>
+            </w:tcMar>
+          </w:tcPr>
+          <w:p>
+            <w:r>
+              <w:t xml:space="preserve">Ver movimientos de inventario y compras</w:t>
+            </w:r>
+          </w:p>
+        </w:tc>
+        <w:tc>
+          <w:tcPr>
+            <w:tcW w:type="dxa" w:w="2200"/>
             <w:tcMar>
               <w:top w:type="dxa" w:w="80"/>
               <w:left w:type="dxa" w:w="120"/>
@@ -3065,17 +3235,17 @@
         </w:tc>
         <w:tc>
           <w:tcPr>
-            <w:tcW w:type="dxa" w:w="2400"/>
-            <w:tcMar>
-              <w:top w:type="dxa" w:w="80"/>
-              <w:left w:type="dxa" w:w="120"/>
-              <w:bottom w:type="dxa" w:w="80"/>
-              <w:right w:type="dxa" w:w="120"/>
-            </w:tcMar>
-          </w:tcPr>
-          <w:p>
-            <w:r>
-              <w:t xml:space="preserve">No</w:t>
+            <w:tcW w:type="dxa" w:w="2200"/>
+            <w:tcMar>
+              <w:top w:type="dxa" w:w="80"/>
+              <w:left w:type="dxa" w:w="120"/>
+              <w:bottom w:type="dxa" w:w="80"/>
+              <w:right w:type="dxa" w:w="120"/>
+            </w:tcMar>
+          </w:tcPr>
+          <w:p>
+            <w:r>
+              <w:t xml:space="preserve">Sí</w:t>
             </w:r>
           </w:p>
         </w:tc>
@@ -3083,23 +3253,23 @@
       <w:tr>
         <w:tc>
           <w:tcPr>
-            <w:tcW w:type="dxa" w:w="4600"/>
-            <w:tcMar>
-              <w:top w:type="dxa" w:w="80"/>
-              <w:left w:type="dxa" w:w="120"/>
-              <w:bottom w:type="dxa" w:w="80"/>
-              <w:right w:type="dxa" w:w="120"/>
-            </w:tcMar>
-          </w:tcPr>
-          <w:p>
-            <w:r>
-              <w:t xml:space="preserve">Configuración → Sistema (backups e impresoras)</w:t>
-            </w:r>
-          </w:p>
-        </w:tc>
-        <w:tc>
-          <w:tcPr>
-            <w:tcW w:type="dxa" w:w="2400"/>
+            <w:tcW w:type="dxa" w:w="5000"/>
+            <w:tcMar>
+              <w:top w:type="dxa" w:w="80"/>
+              <w:left w:type="dxa" w:w="120"/>
+              <w:bottom w:type="dxa" w:w="80"/>
+              <w:right w:type="dxa" w:w="120"/>
+            </w:tcMar>
+          </w:tcPr>
+          <w:p>
+            <w:r>
+              <w:t xml:space="preserve">Cambiar precios y stock al editar un producto</w:t>
+            </w:r>
+          </w:p>
+        </w:tc>
+        <w:tc>
+          <w:tcPr>
+            <w:tcW w:type="dxa" w:w="2200"/>
             <w:tcMar>
               <w:top w:type="dxa" w:w="80"/>
               <w:left w:type="dxa" w:w="120"/>
@@ -3115,7 +3285,7 @@
         </w:tc>
         <w:tc>
           <w:tcPr>
-            <w:tcW w:type="dxa" w:w="2400"/>
+            <w:tcW w:type="dxa" w:w="2200"/>
             <w:tcMar>
               <w:top w:type="dxa" w:w="80"/>
               <w:left w:type="dxa" w:w="120"/>
@@ -3133,7 +3303,257 @@
       <w:tr>
         <w:tc>
           <w:tcPr>
-            <w:tcW w:type="dxa" w:w="4600"/>
+            <w:tcW w:type="dxa" w:w="5000"/>
+            <w:tcMar>
+              <w:top w:type="dxa" w:w="80"/>
+              <w:left w:type="dxa" w:w="120"/>
+              <w:bottom w:type="dxa" w:w="80"/>
+              <w:right w:type="dxa" w:w="120"/>
+            </w:tcMar>
+          </w:tcPr>
+          <w:p>
+            <w:r>
+              <w:t xml:space="preserve">Anular ventas; eliminar productos, clientes y compras</w:t>
+            </w:r>
+          </w:p>
+        </w:tc>
+        <w:tc>
+          <w:tcPr>
+            <w:tcW w:type="dxa" w:w="2200"/>
+            <w:tcMar>
+              <w:top w:type="dxa" w:w="80"/>
+              <w:left w:type="dxa" w:w="120"/>
+              <w:bottom w:type="dxa" w:w="80"/>
+              <w:right w:type="dxa" w:w="120"/>
+            </w:tcMar>
+          </w:tcPr>
+          <w:p>
+            <w:r>
+              <w:t xml:space="preserve">Sí</w:t>
+            </w:r>
+          </w:p>
+        </w:tc>
+        <w:tc>
+          <w:tcPr>
+            <w:tcW w:type="dxa" w:w="2200"/>
+            <w:tcMar>
+              <w:top w:type="dxa" w:w="80"/>
+              <w:left w:type="dxa" w:w="120"/>
+              <w:bottom w:type="dxa" w:w="80"/>
+              <w:right w:type="dxa" w:w="120"/>
+            </w:tcMar>
+          </w:tcPr>
+          <w:p>
+            <w:r>
+              <w:t xml:space="preserve">No</w:t>
+            </w:r>
+          </w:p>
+        </w:tc>
+      </w:tr>
+      <w:tr>
+        <w:tc>
+          <w:tcPr>
+            <w:tcW w:type="dxa" w:w="5000"/>
+            <w:tcMar>
+              <w:top w:type="dxa" w:w="80"/>
+              <w:left w:type="dxa" w:w="120"/>
+              <w:bottom w:type="dxa" w:w="80"/>
+              <w:right w:type="dxa" w:w="120"/>
+            </w:tcMar>
+          </w:tcPr>
+          <w:p>
+            <w:r>
+              <w:t xml:space="preserve">Registrar entradas, salidas y ajustes de inventario; registrar compras</w:t>
+            </w:r>
+          </w:p>
+        </w:tc>
+        <w:tc>
+          <w:tcPr>
+            <w:tcW w:type="dxa" w:w="2200"/>
+            <w:tcMar>
+              <w:top w:type="dxa" w:w="80"/>
+              <w:left w:type="dxa" w:w="120"/>
+              <w:bottom w:type="dxa" w:w="80"/>
+              <w:right w:type="dxa" w:w="120"/>
+            </w:tcMar>
+          </w:tcPr>
+          <w:p>
+            <w:r>
+              <w:t xml:space="preserve">Sí</w:t>
+            </w:r>
+          </w:p>
+        </w:tc>
+        <w:tc>
+          <w:tcPr>
+            <w:tcW w:type="dxa" w:w="2200"/>
+            <w:tcMar>
+              <w:top w:type="dxa" w:w="80"/>
+              <w:left w:type="dxa" w:w="120"/>
+              <w:bottom w:type="dxa" w:w="80"/>
+              <w:right w:type="dxa" w:w="120"/>
+            </w:tcMar>
+          </w:tcPr>
+          <w:p>
+            <w:r>
+              <w:t xml:space="preserve">No</w:t>
+            </w:r>
+          </w:p>
+        </w:tc>
+      </w:tr>
+      <w:tr>
+        <w:tc>
+          <w:tcPr>
+            <w:tcW w:type="dxa" w:w="5000"/>
+            <w:tcMar>
+              <w:top w:type="dxa" w:w="80"/>
+              <w:left w:type="dxa" w:w="120"/>
+              <w:bottom w:type="dxa" w:w="80"/>
+              <w:right w:type="dxa" w:w="120"/>
+            </w:tcMar>
+          </w:tcPr>
+          <w:p>
+            <w:r>
+              <w:t xml:space="preserve">Configuración → General (editar datos del negocio)</w:t>
+            </w:r>
+          </w:p>
+        </w:tc>
+        <w:tc>
+          <w:tcPr>
+            <w:tcW w:type="dxa" w:w="2200"/>
+            <w:tcMar>
+              <w:top w:type="dxa" w:w="80"/>
+              <w:left w:type="dxa" w:w="120"/>
+              <w:bottom w:type="dxa" w:w="80"/>
+              <w:right w:type="dxa" w:w="120"/>
+            </w:tcMar>
+          </w:tcPr>
+          <w:p>
+            <w:r>
+              <w:t xml:space="preserve">Sí</w:t>
+            </w:r>
+          </w:p>
+        </w:tc>
+        <w:tc>
+          <w:tcPr>
+            <w:tcW w:type="dxa" w:w="2200"/>
+            <w:tcMar>
+              <w:top w:type="dxa" w:w="80"/>
+              <w:left w:type="dxa" w:w="120"/>
+              <w:bottom w:type="dxa" w:w="80"/>
+              <w:right w:type="dxa" w:w="120"/>
+            </w:tcMar>
+          </w:tcPr>
+          <w:p>
+            <w:r>
+              <w:t xml:space="preserve">No</w:t>
+            </w:r>
+          </w:p>
+        </w:tc>
+      </w:tr>
+      <w:tr>
+        <w:tc>
+          <w:tcPr>
+            <w:tcW w:type="dxa" w:w="5000"/>
+            <w:tcMar>
+              <w:top w:type="dxa" w:w="80"/>
+              <w:left w:type="dxa" w:w="120"/>
+              <w:bottom w:type="dxa" w:w="80"/>
+              <w:right w:type="dxa" w:w="120"/>
+            </w:tcMar>
+          </w:tcPr>
+          <w:p>
+            <w:r>
+              <w:t xml:space="preserve">Configuración → Cambiar mi contraseña</w:t>
+            </w:r>
+          </w:p>
+        </w:tc>
+        <w:tc>
+          <w:tcPr>
+            <w:tcW w:type="dxa" w:w="2200"/>
+            <w:tcMar>
+              <w:top w:type="dxa" w:w="80"/>
+              <w:left w:type="dxa" w:w="120"/>
+              <w:bottom w:type="dxa" w:w="80"/>
+              <w:right w:type="dxa" w:w="120"/>
+            </w:tcMar>
+          </w:tcPr>
+          <w:p>
+            <w:r>
+              <w:t xml:space="preserve">Sí</w:t>
+            </w:r>
+          </w:p>
+        </w:tc>
+        <w:tc>
+          <w:tcPr>
+            <w:tcW w:type="dxa" w:w="2200"/>
+            <w:tcMar>
+              <w:top w:type="dxa" w:w="80"/>
+              <w:left w:type="dxa" w:w="120"/>
+              <w:bottom w:type="dxa" w:w="80"/>
+              <w:right w:type="dxa" w:w="120"/>
+            </w:tcMar>
+          </w:tcPr>
+          <w:p>
+            <w:r>
+              <w:t xml:space="preserve">Sí</w:t>
+            </w:r>
+          </w:p>
+        </w:tc>
+      </w:tr>
+      <w:tr>
+        <w:tc>
+          <w:tcPr>
+            <w:tcW w:type="dxa" w:w="5000"/>
+            <w:tcMar>
+              <w:top w:type="dxa" w:w="80"/>
+              <w:left w:type="dxa" w:w="120"/>
+              <w:bottom w:type="dxa" w:w="80"/>
+              <w:right w:type="dxa" w:w="120"/>
+            </w:tcMar>
+          </w:tcPr>
+          <w:p>
+            <w:r>
+              <w:t xml:space="preserve">Configuración → Usuarios, Roles y Sistema</w:t>
+            </w:r>
+          </w:p>
+        </w:tc>
+        <w:tc>
+          <w:tcPr>
+            <w:tcW w:type="dxa" w:w="2200"/>
+            <w:tcMar>
+              <w:top w:type="dxa" w:w="80"/>
+              <w:left w:type="dxa" w:w="120"/>
+              <w:bottom w:type="dxa" w:w="80"/>
+              <w:right w:type="dxa" w:w="120"/>
+            </w:tcMar>
+          </w:tcPr>
+          <w:p>
+            <w:r>
+              <w:t xml:space="preserve">Sí</w:t>
+            </w:r>
+          </w:p>
+        </w:tc>
+        <w:tc>
+          <w:tcPr>
+            <w:tcW w:type="dxa" w:w="2200"/>
+            <w:tcMar>
+              <w:top w:type="dxa" w:w="80"/>
+              <w:left w:type="dxa" w:w="120"/>
+              <w:bottom w:type="dxa" w:w="80"/>
+              <w:right w:type="dxa" w:w="120"/>
+            </w:tcMar>
+          </w:tcPr>
+          <w:p>
+            <w:r>
+              <w:t xml:space="preserve">No</w:t>
+            </w:r>
+          </w:p>
+        </w:tc>
+      </w:tr>
+      <w:tr>
+        <w:tc>
+          <w:tcPr>
+            <w:tcW w:type="dxa" w:w="5000"/>
             <w:tcMar>
               <w:top w:type="dxa" w:w="80"/>
               <w:left w:type="dxa" w:w="120"/>
@@ -3149,7 +3569,7 @@
         </w:tc>
         <w:tc>
           <w:tcPr>
-            <w:tcW w:type="dxa" w:w="2400"/>
+            <w:tcW w:type="dxa" w:w="2200"/>
             <w:tcMar>
               <w:top w:type="dxa" w:w="80"/>
               <w:left w:type="dxa" w:w="120"/>
@@ -3165,7 +3585,7 @@
         </w:tc>
         <w:tc>
           <w:tcPr>
-            <w:tcW w:type="dxa" w:w="2400"/>
+            <w:tcW w:type="dxa" w:w="2200"/>
             <w:tcMar>
               <w:top w:type="dxa" w:w="80"/>
               <w:left w:type="dxa" w:w="120"/>
@@ -3183,10 +3603,1291 @@
     </w:tbl>
     <w:p>
       <w:pPr>
-        <w:spacing w:after="160" w:before="200"/>
-      </w:pPr>
-      <w:r>
-        <w:t xml:space="preserve">El rol de cada usuario se asigna al crearlo o editarlo desde Configuración → Usuarios (sección 12.2). Toda venta y todo registro de auditoría quedan asociados al usuario que inició sesión en ese momento.</w:t>
+        <w:spacing w:after="160"/>
+      </w:pPr>
+      <w:r>
+        <w:t xml:space="preserve"/>
+      </w:r>
+    </w:p>
+    <w:p>
+      <w:pPr>
+        <w:pStyle w:val="Heading2"/>
+        <w:spacing w:after="160" w:before="320"/>
+      </w:pPr>
+      <w:r>
+        <w:t xml:space="preserve">14.2 Crear o editar un rol (solo Administrador)</w:t>
+      </w:r>
+    </w:p>
+    <w:p>
+      <w:pPr>
+        <w:spacing w:after="160"/>
+      </w:pPr>
+      <w:r>
+        <w:t xml:space="preserve">Ve a Configuración → Roles. Allí aparece la lista de roles con su número de permisos y de usuarios asignados.</w:t>
+      </w:r>
+    </w:p>
+    <w:p>
+      <w:pPr>
+        <w:pStyle w:val="ListParagraph"/>
+        <w:numPr>
+          <w:ilvl w:val="0"/>
+          <w:numId w:val="2"/>
+        </w:numPr>
+        <w:spacing w:after="80"/>
+      </w:pPr>
+      <w:r>
+        <w:rPr>
+          <w:b/>
+          <w:bCs/>
+        </w:rPr>
+        <w:t xml:space="preserve">Crear: </w:t>
+      </w:r>
+      <w:r>
+        <w:t xml:space="preserve">presiona "Nuevo rol", escribe el nombre y una descripción opcional, marca los permisos que le corresponden y presiona "Guardar rol". Debes marcar al menos un permiso.</w:t>
+      </w:r>
+    </w:p>
+    <w:p>
+      <w:pPr>
+        <w:pStyle w:val="ListParagraph"/>
+        <w:numPr>
+          <w:ilvl w:val="0"/>
+          <w:numId w:val="2"/>
+        </w:numPr>
+        <w:spacing w:after="80"/>
+      </w:pPr>
+      <w:r>
+        <w:rPr>
+          <w:b/>
+          <w:bCs/>
+        </w:rPr>
+        <w:t xml:space="preserve">Editar: </w:t>
+      </w:r>
+      <w:r>
+        <w:t xml:space="preserve">usa el ícono del lápiz de la fila. Los cambios aplican la próxima vez que cada usuario con ese rol inicie sesión.</w:t>
+      </w:r>
+    </w:p>
+    <w:p>
+      <w:pPr>
+        <w:pStyle w:val="ListParagraph"/>
+        <w:numPr>
+          <w:ilvl w:val="0"/>
+          <w:numId w:val="2"/>
+        </w:numPr>
+        <w:spacing w:after="80"/>
+      </w:pPr>
+      <w:r>
+        <w:rPr>
+          <w:b/>
+          <w:bCs/>
+        </w:rPr>
+        <w:t xml:space="preserve">Eliminar: </w:t>
+      </w:r>
+      <w:r>
+        <w:t xml:space="preserve">usa el ícono del cesto de basura. Un rol con usuarios asignados no se puede eliminar: primero reasigna esos usuarios a otro rol.</w:t>
+      </w:r>
+    </w:p>
+    <w:p>
+      <w:pPr>
+        <w:pBdr>
+          <w:left w:val="single" w:color="4F46E5" w:sz="18" w:space="8"/>
+        </w:pBdr>
+        <w:shd w:fill="EEF2FF" w:color="auto" w:val="clear"/>
+        <w:spacing w:after="200" w:before="160"/>
+        <w:ind w:left="100"/>
+      </w:pPr>
+      <w:r>
+        <w:rPr>
+          <w:b/>
+          <w:bCs/>
+        </w:rPr>
+        <w:t xml:space="preserve">Sugerencia: </w:t>
+      </w:r>
+      <w:r>
+        <w:t xml:space="preserve">Al marcar un permiso, NovaPOS marca también los que necesita (por ejemplo, para cambiar precios hace falta poder editar productos), y al desmarcarlo quita los que dependían de él.</w:t>
+      </w:r>
+    </w:p>
+    <w:p>
+      <w:pPr>
+        <w:pStyle w:val="Heading2"/>
+        <w:spacing w:after="160" w:before="320"/>
+      </w:pPr>
+      <w:r>
+        <w:t xml:space="preserve">14.3 Lista de permisos</w:t>
+      </w:r>
+    </w:p>
+    <w:p>
+      <w:pPr>
+        <w:spacing w:after="160"/>
+      </w:pPr>
+      <w:r>
+        <w:t xml:space="preserve">Estos son los permisos que puedes combinar en un rol. Ver productos, clientes y ventas está disponible para todos los roles, porque se necesitan para poder vender.</w:t>
+      </w:r>
+    </w:p>
+    <w:tbl>
+      <w:tblPr>
+        <w:tblW w:type="dxa" w:w="9400"/>
+        <w:tblBorders>
+          <w:top w:val="single" w:color="auto" w:sz="4"/>
+          <w:left w:val="single" w:color="auto" w:sz="4"/>
+          <w:bottom w:val="single" w:color="auto" w:sz="4"/>
+          <w:right w:val="single" w:color="auto" w:sz="4"/>
+          <w:insideH w:val="single" w:color="auto" w:sz="4"/>
+          <w:insideV w:val="single" w:color="auto" w:sz="4"/>
+        </w:tblBorders>
+      </w:tblPr>
+      <w:tblGrid>
+        <w:gridCol w:w="1700"/>
+        <w:gridCol w:w="3100"/>
+        <w:gridCol w:w="4600"/>
+      </w:tblGrid>
+      <w:tr>
+        <w:trPr>
+          <w:tblHeader/>
+        </w:trPr>
+        <w:tc>
+          <w:tcPr>
+            <w:tcW w:type="dxa" w:w="1700"/>
+            <w:shd w:fill="4F46E5" w:val="clear"/>
+            <w:tcMar>
+              <w:top w:type="dxa" w:w="80"/>
+              <w:left w:type="dxa" w:w="120"/>
+              <w:bottom w:type="dxa" w:w="80"/>
+              <w:right w:type="dxa" w:w="120"/>
+            </w:tcMar>
+            <w:vAlign w:val="center"/>
+          </w:tcPr>
+          <w:p>
+            <w:r>
+              <w:rPr>
+                <w:b/>
+                <w:bCs/>
+                <w:color w:val="FFFFFF"/>
+              </w:rPr>
+              <w:t xml:space="preserve">Grupo</w:t>
+            </w:r>
+          </w:p>
+        </w:tc>
+        <w:tc>
+          <w:tcPr>
+            <w:tcW w:type="dxa" w:w="3100"/>
+            <w:shd w:fill="4F46E5" w:val="clear"/>
+            <w:tcMar>
+              <w:top w:type="dxa" w:w="80"/>
+              <w:left w:type="dxa" w:w="120"/>
+              <w:bottom w:type="dxa" w:w="80"/>
+              <w:right w:type="dxa" w:w="120"/>
+            </w:tcMar>
+            <w:vAlign w:val="center"/>
+          </w:tcPr>
+          <w:p>
+            <w:r>
+              <w:rPr>
+                <w:b/>
+                <w:bCs/>
+                <w:color w:val="FFFFFF"/>
+              </w:rPr>
+              <w:t xml:space="preserve">Permiso</w:t>
+            </w:r>
+          </w:p>
+        </w:tc>
+        <w:tc>
+          <w:tcPr>
+            <w:tcW w:type="dxa" w:w="4600"/>
+            <w:shd w:fill="4F46E5" w:val="clear"/>
+            <w:tcMar>
+              <w:top w:type="dxa" w:w="80"/>
+              <w:left w:type="dxa" w:w="120"/>
+              <w:bottom w:type="dxa" w:w="80"/>
+              <w:right w:type="dxa" w:w="120"/>
+            </w:tcMar>
+            <w:vAlign w:val="center"/>
+          </w:tcPr>
+          <w:p>
+            <w:r>
+              <w:rPr>
+                <w:b/>
+                <w:bCs/>
+                <w:color w:val="FFFFFF"/>
+              </w:rPr>
+              <w:t xml:space="preserve">Qué permite</w:t>
+            </w:r>
+          </w:p>
+        </w:tc>
+      </w:tr>
+      <w:tr>
+        <w:tc>
+          <w:tcPr>
+            <w:tcW w:type="dxa" w:w="1700"/>
+            <w:tcMar>
+              <w:top w:type="dxa" w:w="80"/>
+              <w:left w:type="dxa" w:w="120"/>
+              <w:bottom w:type="dxa" w:w="80"/>
+              <w:right w:type="dxa" w:w="120"/>
+            </w:tcMar>
+          </w:tcPr>
+          <w:p>
+            <w:r>
+              <w:t xml:space="preserve">Ventas y facturas</w:t>
+            </w:r>
+          </w:p>
+        </w:tc>
+        <w:tc>
+          <w:tcPr>
+            <w:tcW w:type="dxa" w:w="3100"/>
+            <w:tcMar>
+              <w:top w:type="dxa" w:w="80"/>
+              <w:left w:type="dxa" w:w="120"/>
+              <w:bottom w:type="dxa" w:w="80"/>
+              <w:right w:type="dxa" w:w="120"/>
+            </w:tcMar>
+          </w:tcPr>
+          <w:p>
+            <w:r>
+              <w:t xml:space="preserve">Registrar ventas</w:t>
+            </w:r>
+          </w:p>
+        </w:tc>
+        <w:tc>
+          <w:tcPr>
+            <w:tcW w:type="dxa" w:w="4600"/>
+            <w:tcMar>
+              <w:top w:type="dxa" w:w="80"/>
+              <w:left w:type="dxa" w:w="120"/>
+              <w:bottom w:type="dxa" w:w="80"/>
+              <w:right w:type="dxa" w:w="120"/>
+            </w:tcMar>
+          </w:tcPr>
+          <w:p>
+            <w:r>
+              <w:t xml:space="preserve">Usar el módulo Ventas y ver, imprimir o exportar la factura que acabas de emitir.</w:t>
+            </w:r>
+          </w:p>
+        </w:tc>
+      </w:tr>
+      <w:tr>
+        <w:tc>
+          <w:tcPr>
+            <w:tcW w:type="dxa" w:w="1700"/>
+            <w:tcMar>
+              <w:top w:type="dxa" w:w="80"/>
+              <w:left w:type="dxa" w:w="120"/>
+              <w:bottom w:type="dxa" w:w="80"/>
+              <w:right w:type="dxa" w:w="120"/>
+            </w:tcMar>
+          </w:tcPr>
+          <w:p>
+            <w:r>
+              <w:t xml:space="preserve"/>
+            </w:r>
+          </w:p>
+        </w:tc>
+        <w:tc>
+          <w:tcPr>
+            <w:tcW w:type="dxa" w:w="3100"/>
+            <w:tcMar>
+              <w:top w:type="dxa" w:w="80"/>
+              <w:left w:type="dxa" w:w="120"/>
+              <w:bottom w:type="dxa" w:w="80"/>
+              <w:right w:type="dxa" w:w="120"/>
+            </w:tcMar>
+          </w:tcPr>
+          <w:p>
+            <w:r>
+              <w:t xml:space="preserve">Anular ventas</w:t>
+            </w:r>
+          </w:p>
+        </w:tc>
+        <w:tc>
+          <w:tcPr>
+            <w:tcW w:type="dxa" w:w="4600"/>
+            <w:tcMar>
+              <w:top w:type="dxa" w:w="80"/>
+              <w:left w:type="dxa" w:w="120"/>
+              <w:bottom w:type="dxa" w:w="80"/>
+              <w:right w:type="dxa" w:w="120"/>
+            </w:tcMar>
+          </w:tcPr>
+          <w:p>
+            <w:r>
+              <w:t xml:space="preserve">Anular una factura; el stock se devuelve al inventario.</w:t>
+            </w:r>
+          </w:p>
+        </w:tc>
+      </w:tr>
+      <w:tr>
+        <w:tc>
+          <w:tcPr>
+            <w:tcW w:type="dxa" w:w="1700"/>
+            <w:tcMar>
+              <w:top w:type="dxa" w:w="80"/>
+              <w:left w:type="dxa" w:w="120"/>
+              <w:bottom w:type="dxa" w:w="80"/>
+              <w:right w:type="dxa" w:w="120"/>
+            </w:tcMar>
+          </w:tcPr>
+          <w:p>
+            <w:r>
+              <w:t xml:space="preserve"/>
+            </w:r>
+          </w:p>
+        </w:tc>
+        <w:tc>
+          <w:tcPr>
+            <w:tcW w:type="dxa" w:w="3100"/>
+            <w:tcMar>
+              <w:top w:type="dxa" w:w="80"/>
+              <w:left w:type="dxa" w:w="120"/>
+              <w:bottom w:type="dxa" w:w="80"/>
+              <w:right w:type="dxa" w:w="120"/>
+            </w:tcMar>
+          </w:tcPr>
+          <w:p>
+            <w:r>
+              <w:t xml:space="preserve">Consultar, reimprimir y exportar facturas</w:t>
+            </w:r>
+          </w:p>
+        </w:tc>
+        <w:tc>
+          <w:tcPr>
+            <w:tcW w:type="dxa" w:w="4600"/>
+            <w:tcMar>
+              <w:top w:type="dxa" w:w="80"/>
+              <w:left w:type="dxa" w:w="120"/>
+              <w:bottom w:type="dxa" w:w="80"/>
+              <w:right w:type="dxa" w:w="120"/>
+            </w:tcMar>
+          </w:tcPr>
+          <w:p>
+            <w:r>
+              <w:t xml:space="preserve">Entrar al módulo Facturas y trabajar con todo el historial.</w:t>
+            </w:r>
+          </w:p>
+        </w:tc>
+      </w:tr>
+      <w:tr>
+        <w:tc>
+          <w:tcPr>
+            <w:tcW w:type="dxa" w:w="1700"/>
+            <w:tcMar>
+              <w:top w:type="dxa" w:w="80"/>
+              <w:left w:type="dxa" w:w="120"/>
+              <w:bottom w:type="dxa" w:w="80"/>
+              <w:right w:type="dxa" w:w="120"/>
+            </w:tcMar>
+          </w:tcPr>
+          <w:p>
+            <w:r>
+              <w:t xml:space="preserve">Productos</w:t>
+            </w:r>
+          </w:p>
+        </w:tc>
+        <w:tc>
+          <w:tcPr>
+            <w:tcW w:type="dxa" w:w="3100"/>
+            <w:tcMar>
+              <w:top w:type="dxa" w:w="80"/>
+              <w:left w:type="dxa" w:w="120"/>
+              <w:bottom w:type="dxa" w:w="80"/>
+              <w:right w:type="dxa" w:w="120"/>
+            </w:tcMar>
+          </w:tcPr>
+          <w:p>
+            <w:r>
+              <w:t xml:space="preserve">Crear y editar productos</w:t>
+            </w:r>
+          </w:p>
+        </w:tc>
+        <w:tc>
+          <w:tcPr>
+            <w:tcW w:type="dxa" w:w="4600"/>
+            <w:tcMar>
+              <w:top w:type="dxa" w:w="80"/>
+              <w:left w:type="dxa" w:w="120"/>
+              <w:bottom w:type="dxa" w:w="80"/>
+              <w:right w:type="dxa" w:w="120"/>
+            </w:tcMar>
+          </w:tcPr>
+          <w:p>
+            <w:r>
+              <w:t xml:space="preserve">Crear productos y editar nombre, categoría, descripción y stock mínimo.</w:t>
+            </w:r>
+          </w:p>
+        </w:tc>
+      </w:tr>
+      <w:tr>
+        <w:tc>
+          <w:tcPr>
+            <w:tcW w:type="dxa" w:w="1700"/>
+            <w:tcMar>
+              <w:top w:type="dxa" w:w="80"/>
+              <w:left w:type="dxa" w:w="120"/>
+              <w:bottom w:type="dxa" w:w="80"/>
+              <w:right w:type="dxa" w:w="120"/>
+            </w:tcMar>
+          </w:tcPr>
+          <w:p>
+            <w:r>
+              <w:t xml:space="preserve"/>
+            </w:r>
+          </w:p>
+        </w:tc>
+        <w:tc>
+          <w:tcPr>
+            <w:tcW w:type="dxa" w:w="3100"/>
+            <w:tcMar>
+              <w:top w:type="dxa" w:w="80"/>
+              <w:left w:type="dxa" w:w="120"/>
+              <w:bottom w:type="dxa" w:w="80"/>
+              <w:right w:type="dxa" w:w="120"/>
+            </w:tcMar>
+          </w:tcPr>
+          <w:p>
+            <w:r>
+              <w:t xml:space="preserve">Cambiar precios y stock al editar un producto</w:t>
+            </w:r>
+          </w:p>
+        </w:tc>
+        <w:tc>
+          <w:tcPr>
+            <w:tcW w:type="dxa" w:w="4600"/>
+            <w:tcMar>
+              <w:top w:type="dxa" w:w="80"/>
+              <w:left w:type="dxa" w:w="120"/>
+              <w:bottom w:type="dxa" w:w="80"/>
+              <w:right w:type="dxa" w:w="120"/>
+            </w:tcMar>
+          </w:tcPr>
+          <w:p>
+            <w:r>
+              <w:t xml:space="preserve">Modificar precios de compra, detal y mayorista, y el stock, desde el formulario del producto.</w:t>
+            </w:r>
+          </w:p>
+        </w:tc>
+      </w:tr>
+      <w:tr>
+        <w:tc>
+          <w:tcPr>
+            <w:tcW w:type="dxa" w:w="1700"/>
+            <w:tcMar>
+              <w:top w:type="dxa" w:w="80"/>
+              <w:left w:type="dxa" w:w="120"/>
+              <w:bottom w:type="dxa" w:w="80"/>
+              <w:right w:type="dxa" w:w="120"/>
+            </w:tcMar>
+          </w:tcPr>
+          <w:p>
+            <w:r>
+              <w:t xml:space="preserve"/>
+            </w:r>
+          </w:p>
+        </w:tc>
+        <w:tc>
+          <w:tcPr>
+            <w:tcW w:type="dxa" w:w="3100"/>
+            <w:tcMar>
+              <w:top w:type="dxa" w:w="80"/>
+              <w:left w:type="dxa" w:w="120"/>
+              <w:bottom w:type="dxa" w:w="80"/>
+              <w:right w:type="dxa" w:w="120"/>
+            </w:tcMar>
+          </w:tcPr>
+          <w:p>
+            <w:r>
+              <w:t xml:space="preserve">Eliminar o desactivar productos</w:t>
+            </w:r>
+          </w:p>
+        </w:tc>
+        <w:tc>
+          <w:tcPr>
+            <w:tcW w:type="dxa" w:w="4600"/>
+            <w:tcMar>
+              <w:top w:type="dxa" w:w="80"/>
+              <w:left w:type="dxa" w:w="120"/>
+              <w:bottom w:type="dxa" w:w="80"/>
+              <w:right w:type="dxa" w:w="120"/>
+            </w:tcMar>
+          </w:tcPr>
+          <w:p>
+            <w:r>
+              <w:t xml:space="preserve">Quitar productos del catálogo.</w:t>
+            </w:r>
+          </w:p>
+        </w:tc>
+      </w:tr>
+      <w:tr>
+        <w:tc>
+          <w:tcPr>
+            <w:tcW w:type="dxa" w:w="1700"/>
+            <w:tcMar>
+              <w:top w:type="dxa" w:w="80"/>
+              <w:left w:type="dxa" w:w="120"/>
+              <w:bottom w:type="dxa" w:w="80"/>
+              <w:right w:type="dxa" w:w="120"/>
+            </w:tcMar>
+          </w:tcPr>
+          <w:p>
+            <w:r>
+              <w:t xml:space="preserve">Clientes</w:t>
+            </w:r>
+          </w:p>
+        </w:tc>
+        <w:tc>
+          <w:tcPr>
+            <w:tcW w:type="dxa" w:w="3100"/>
+            <w:tcMar>
+              <w:top w:type="dxa" w:w="80"/>
+              <w:left w:type="dxa" w:w="120"/>
+              <w:bottom w:type="dxa" w:w="80"/>
+              <w:right w:type="dxa" w:w="120"/>
+            </w:tcMar>
+          </w:tcPr>
+          <w:p>
+            <w:r>
+              <w:t xml:space="preserve">Crear y editar clientes</w:t>
+            </w:r>
+          </w:p>
+        </w:tc>
+        <w:tc>
+          <w:tcPr>
+            <w:tcW w:type="dxa" w:w="4600"/>
+            <w:tcMar>
+              <w:top w:type="dxa" w:w="80"/>
+              <w:left w:type="dxa" w:w="120"/>
+              <w:bottom w:type="dxa" w:w="80"/>
+              <w:right w:type="dxa" w:w="120"/>
+            </w:tcMar>
+          </w:tcPr>
+          <w:p>
+            <w:r>
+              <w:t xml:space="preserve">Registrar clientes y cambiar sus datos.</w:t>
+            </w:r>
+          </w:p>
+        </w:tc>
+      </w:tr>
+      <w:tr>
+        <w:tc>
+          <w:tcPr>
+            <w:tcW w:type="dxa" w:w="1700"/>
+            <w:tcMar>
+              <w:top w:type="dxa" w:w="80"/>
+              <w:left w:type="dxa" w:w="120"/>
+              <w:bottom w:type="dxa" w:w="80"/>
+              <w:right w:type="dxa" w:w="120"/>
+            </w:tcMar>
+          </w:tcPr>
+          <w:p>
+            <w:r>
+              <w:t xml:space="preserve"/>
+            </w:r>
+          </w:p>
+        </w:tc>
+        <w:tc>
+          <w:tcPr>
+            <w:tcW w:type="dxa" w:w="3100"/>
+            <w:tcMar>
+              <w:top w:type="dxa" w:w="80"/>
+              <w:left w:type="dxa" w:w="120"/>
+              <w:bottom w:type="dxa" w:w="80"/>
+              <w:right w:type="dxa" w:w="120"/>
+            </w:tcMar>
+          </w:tcPr>
+          <w:p>
+            <w:r>
+              <w:t xml:space="preserve">Eliminar clientes</w:t>
+            </w:r>
+          </w:p>
+        </w:tc>
+        <w:tc>
+          <w:tcPr>
+            <w:tcW w:type="dxa" w:w="4600"/>
+            <w:tcMar>
+              <w:top w:type="dxa" w:w="80"/>
+              <w:left w:type="dxa" w:w="120"/>
+              <w:bottom w:type="dxa" w:w="80"/>
+              <w:right w:type="dxa" w:w="120"/>
+            </w:tcMar>
+          </w:tcPr>
+          <w:p>
+            <w:r>
+              <w:t xml:space="preserve">Eliminar o desactivar clientes.</w:t>
+            </w:r>
+          </w:p>
+        </w:tc>
+      </w:tr>
+      <w:tr>
+        <w:tc>
+          <w:tcPr>
+            <w:tcW w:type="dxa" w:w="1700"/>
+            <w:tcMar>
+              <w:top w:type="dxa" w:w="80"/>
+              <w:left w:type="dxa" w:w="120"/>
+              <w:bottom w:type="dxa" w:w="80"/>
+              <w:right w:type="dxa" w:w="120"/>
+            </w:tcMar>
+          </w:tcPr>
+          <w:p>
+            <w:r>
+              <w:t xml:space="preserve">Inventario</w:t>
+            </w:r>
+          </w:p>
+        </w:tc>
+        <w:tc>
+          <w:tcPr>
+            <w:tcW w:type="dxa" w:w="3100"/>
+            <w:tcMar>
+              <w:top w:type="dxa" w:w="80"/>
+              <w:left w:type="dxa" w:w="120"/>
+              <w:bottom w:type="dxa" w:w="80"/>
+              <w:right w:type="dxa" w:w="120"/>
+            </w:tcMar>
+          </w:tcPr>
+          <w:p>
+            <w:r>
+              <w:t xml:space="preserve">Ver movimientos de inventario</w:t>
+            </w:r>
+          </w:p>
+        </w:tc>
+        <w:tc>
+          <w:tcPr>
+            <w:tcW w:type="dxa" w:w="4600"/>
+            <w:tcMar>
+              <w:top w:type="dxa" w:w="80"/>
+              <w:left w:type="dxa" w:w="120"/>
+              <w:bottom w:type="dxa" w:w="80"/>
+              <w:right w:type="dxa" w:w="120"/>
+            </w:tcMar>
+          </w:tcPr>
+          <w:p>
+            <w:r>
+              <w:t xml:space="preserve">Entrar al módulo Inventario y consultar el historial.</w:t>
+            </w:r>
+          </w:p>
+        </w:tc>
+      </w:tr>
+      <w:tr>
+        <w:tc>
+          <w:tcPr>
+            <w:tcW w:type="dxa" w:w="1700"/>
+            <w:tcMar>
+              <w:top w:type="dxa" w:w="80"/>
+              <w:left w:type="dxa" w:w="120"/>
+              <w:bottom w:type="dxa" w:w="80"/>
+              <w:right w:type="dxa" w:w="120"/>
+            </w:tcMar>
+          </w:tcPr>
+          <w:p>
+            <w:r>
+              <w:t xml:space="preserve"/>
+            </w:r>
+          </w:p>
+        </w:tc>
+        <w:tc>
+          <w:tcPr>
+            <w:tcW w:type="dxa" w:w="3100"/>
+            <w:tcMar>
+              <w:top w:type="dxa" w:w="80"/>
+              <w:left w:type="dxa" w:w="120"/>
+              <w:bottom w:type="dxa" w:w="80"/>
+              <w:right w:type="dxa" w:w="120"/>
+            </w:tcMar>
+          </w:tcPr>
+          <w:p>
+            <w:r>
+              <w:t xml:space="preserve">Registrar entradas, salidas y ajustes</w:t>
+            </w:r>
+          </w:p>
+        </w:tc>
+        <w:tc>
+          <w:tcPr>
+            <w:tcW w:type="dxa" w:w="4600"/>
+            <w:tcMar>
+              <w:top w:type="dxa" w:w="80"/>
+              <w:left w:type="dxa" w:w="120"/>
+              <w:bottom w:type="dxa" w:w="80"/>
+              <w:right w:type="dxa" w:w="120"/>
+            </w:tcMar>
+          </w:tcPr>
+          <w:p>
+            <w:r>
+              <w:t xml:space="preserve">Crear movimientos manuales de stock.</w:t>
+            </w:r>
+          </w:p>
+        </w:tc>
+      </w:tr>
+      <w:tr>
+        <w:tc>
+          <w:tcPr>
+            <w:tcW w:type="dxa" w:w="1700"/>
+            <w:tcMar>
+              <w:top w:type="dxa" w:w="80"/>
+              <w:left w:type="dxa" w:w="120"/>
+              <w:bottom w:type="dxa" w:w="80"/>
+              <w:right w:type="dxa" w:w="120"/>
+            </w:tcMar>
+          </w:tcPr>
+          <w:p>
+            <w:r>
+              <w:t xml:space="preserve">Compras</w:t>
+            </w:r>
+          </w:p>
+        </w:tc>
+        <w:tc>
+          <w:tcPr>
+            <w:tcW w:type="dxa" w:w="3100"/>
+            <w:tcMar>
+              <w:top w:type="dxa" w:w="80"/>
+              <w:left w:type="dxa" w:w="120"/>
+              <w:bottom w:type="dxa" w:w="80"/>
+              <w:right w:type="dxa" w:w="120"/>
+            </w:tcMar>
+          </w:tcPr>
+          <w:p>
+            <w:r>
+              <w:t xml:space="preserve">Ver compras</w:t>
+            </w:r>
+          </w:p>
+        </w:tc>
+        <w:tc>
+          <w:tcPr>
+            <w:tcW w:type="dxa" w:w="4600"/>
+            <w:tcMar>
+              <w:top w:type="dxa" w:w="80"/>
+              <w:left w:type="dxa" w:w="120"/>
+              <w:bottom w:type="dxa" w:w="80"/>
+              <w:right w:type="dxa" w:w="120"/>
+            </w:tcMar>
+          </w:tcPr>
+          <w:p>
+            <w:r>
+              <w:t xml:space="preserve">Entrar al módulo Compras y consultar el historial.</w:t>
+            </w:r>
+          </w:p>
+        </w:tc>
+      </w:tr>
+      <w:tr>
+        <w:tc>
+          <w:tcPr>
+            <w:tcW w:type="dxa" w:w="1700"/>
+            <w:tcMar>
+              <w:top w:type="dxa" w:w="80"/>
+              <w:left w:type="dxa" w:w="120"/>
+              <w:bottom w:type="dxa" w:w="80"/>
+              <w:right w:type="dxa" w:w="120"/>
+            </w:tcMar>
+          </w:tcPr>
+          <w:p>
+            <w:r>
+              <w:t xml:space="preserve"/>
+            </w:r>
+          </w:p>
+        </w:tc>
+        <w:tc>
+          <w:tcPr>
+            <w:tcW w:type="dxa" w:w="3100"/>
+            <w:tcMar>
+              <w:top w:type="dxa" w:w="80"/>
+              <w:left w:type="dxa" w:w="120"/>
+              <w:bottom w:type="dxa" w:w="80"/>
+              <w:right w:type="dxa" w:w="120"/>
+            </w:tcMar>
+          </w:tcPr>
+          <w:p>
+            <w:r>
+              <w:t xml:space="preserve">Registrar compras</w:t>
+            </w:r>
+          </w:p>
+        </w:tc>
+        <w:tc>
+          <w:tcPr>
+            <w:tcW w:type="dxa" w:w="4600"/>
+            <w:tcMar>
+              <w:top w:type="dxa" w:w="80"/>
+              <w:left w:type="dxa" w:w="120"/>
+              <w:bottom w:type="dxa" w:w="80"/>
+              <w:right w:type="dxa" w:w="120"/>
+            </w:tcMar>
+          </w:tcPr>
+          <w:p>
+            <w:r>
+              <w:t xml:space="preserve">Crear facturas de compra a proveedores.</w:t>
+            </w:r>
+          </w:p>
+        </w:tc>
+      </w:tr>
+      <w:tr>
+        <w:tc>
+          <w:tcPr>
+            <w:tcW w:type="dxa" w:w="1700"/>
+            <w:tcMar>
+              <w:top w:type="dxa" w:w="80"/>
+              <w:left w:type="dxa" w:w="120"/>
+              <w:bottom w:type="dxa" w:w="80"/>
+              <w:right w:type="dxa" w:w="120"/>
+            </w:tcMar>
+          </w:tcPr>
+          <w:p>
+            <w:r>
+              <w:t xml:space="preserve"/>
+            </w:r>
+          </w:p>
+        </w:tc>
+        <w:tc>
+          <w:tcPr>
+            <w:tcW w:type="dxa" w:w="3100"/>
+            <w:tcMar>
+              <w:top w:type="dxa" w:w="80"/>
+              <w:left w:type="dxa" w:w="120"/>
+              <w:bottom w:type="dxa" w:w="80"/>
+              <w:right w:type="dxa" w:w="120"/>
+            </w:tcMar>
+          </w:tcPr>
+          <w:p>
+            <w:r>
+              <w:t xml:space="preserve">Eliminar compras</w:t>
+            </w:r>
+          </w:p>
+        </w:tc>
+        <w:tc>
+          <w:tcPr>
+            <w:tcW w:type="dxa" w:w="4600"/>
+            <w:tcMar>
+              <w:top w:type="dxa" w:w="80"/>
+              <w:left w:type="dxa" w:w="120"/>
+              <w:bottom w:type="dxa" w:w="80"/>
+              <w:right w:type="dxa" w:w="120"/>
+            </w:tcMar>
+          </w:tcPr>
+          <w:p>
+            <w:r>
+              <w:t xml:space="preserve">Borrar compras registradas.</w:t>
+            </w:r>
+          </w:p>
+        </w:tc>
+      </w:tr>
+      <w:tr>
+        <w:tc>
+          <w:tcPr>
+            <w:tcW w:type="dxa" w:w="1700"/>
+            <w:tcMar>
+              <w:top w:type="dxa" w:w="80"/>
+              <w:left w:type="dxa" w:w="120"/>
+              <w:bottom w:type="dxa" w:w="80"/>
+              <w:right w:type="dxa" w:w="120"/>
+            </w:tcMar>
+          </w:tcPr>
+          <w:p>
+            <w:r>
+              <w:t xml:space="preserve">Informes</w:t>
+            </w:r>
+          </w:p>
+        </w:tc>
+        <w:tc>
+          <w:tcPr>
+            <w:tcW w:type="dxa" w:w="3100"/>
+            <w:tcMar>
+              <w:top w:type="dxa" w:w="80"/>
+              <w:left w:type="dxa" w:w="120"/>
+              <w:bottom w:type="dxa" w:w="80"/>
+              <w:right w:type="dxa" w:w="120"/>
+            </w:tcMar>
+          </w:tcPr>
+          <w:p>
+            <w:r>
+              <w:t xml:space="preserve">Ver el panel de resumen (Dashboard)</w:t>
+            </w:r>
+          </w:p>
+        </w:tc>
+        <w:tc>
+          <w:tcPr>
+            <w:tcW w:type="dxa" w:w="4600"/>
+            <w:tcMar>
+              <w:top w:type="dxa" w:w="80"/>
+              <w:left w:type="dxa" w:w="120"/>
+              <w:bottom w:type="dxa" w:w="80"/>
+              <w:right w:type="dxa" w:w="120"/>
+            </w:tcMar>
+          </w:tcPr>
+          <w:p>
+            <w:r>
+              <w:t xml:space="preserve">Ver las cifras y gráficos de la pantalla de inicio.</w:t>
+            </w:r>
+          </w:p>
+        </w:tc>
+      </w:tr>
+      <w:tr>
+        <w:tc>
+          <w:tcPr>
+            <w:tcW w:type="dxa" w:w="1700"/>
+            <w:tcMar>
+              <w:top w:type="dxa" w:w="80"/>
+              <w:left w:type="dxa" w:w="120"/>
+              <w:bottom w:type="dxa" w:w="80"/>
+              <w:right w:type="dxa" w:w="120"/>
+            </w:tcMar>
+          </w:tcPr>
+          <w:p>
+            <w:r>
+              <w:t xml:space="preserve"/>
+            </w:r>
+          </w:p>
+        </w:tc>
+        <w:tc>
+          <w:tcPr>
+            <w:tcW w:type="dxa" w:w="3100"/>
+            <w:tcMar>
+              <w:top w:type="dxa" w:w="80"/>
+              <w:left w:type="dxa" w:w="120"/>
+              <w:bottom w:type="dxa" w:w="80"/>
+              <w:right w:type="dxa" w:w="120"/>
+            </w:tcMar>
+          </w:tcPr>
+          <w:p>
+            <w:r>
+              <w:t xml:space="preserve">Ver y exportar reportes</w:t>
+            </w:r>
+          </w:p>
+        </w:tc>
+        <w:tc>
+          <w:tcPr>
+            <w:tcW w:type="dxa" w:w="4600"/>
+            <w:tcMar>
+              <w:top w:type="dxa" w:w="80"/>
+              <w:left w:type="dxa" w:w="120"/>
+              <w:bottom w:type="dxa" w:w="80"/>
+              <w:right w:type="dxa" w:w="120"/>
+            </w:tcMar>
+          </w:tcPr>
+          <w:p>
+            <w:r>
+              <w:t xml:space="preserve">Entrar a Reportes y exportarlos a PDF, Excel o CSV.</w:t>
+            </w:r>
+          </w:p>
+        </w:tc>
+      </w:tr>
+      <w:tr>
+        <w:tc>
+          <w:tcPr>
+            <w:tcW w:type="dxa" w:w="1700"/>
+            <w:tcMar>
+              <w:top w:type="dxa" w:w="80"/>
+              <w:left w:type="dxa" w:w="120"/>
+              <w:bottom w:type="dxa" w:w="80"/>
+              <w:right w:type="dxa" w:w="120"/>
+            </w:tcMar>
+          </w:tcPr>
+          <w:p>
+            <w:r>
+              <w:t xml:space="preserve">Administración</w:t>
+            </w:r>
+          </w:p>
+        </w:tc>
+        <w:tc>
+          <w:tcPr>
+            <w:tcW w:type="dxa" w:w="3100"/>
+            <w:tcMar>
+              <w:top w:type="dxa" w:w="80"/>
+              <w:left w:type="dxa" w:w="120"/>
+              <w:bottom w:type="dxa" w:w="80"/>
+              <w:right w:type="dxa" w:w="120"/>
+            </w:tcMar>
+          </w:tcPr>
+          <w:p>
+            <w:r>
+              <w:t xml:space="preserve">Editar la configuración del negocio</w:t>
+            </w:r>
+          </w:p>
+        </w:tc>
+        <w:tc>
+          <w:tcPr>
+            <w:tcW w:type="dxa" w:w="4600"/>
+            <w:tcMar>
+              <w:top w:type="dxa" w:w="80"/>
+              <w:left w:type="dxa" w:w="120"/>
+              <w:bottom w:type="dxa" w:w="80"/>
+              <w:right w:type="dxa" w:w="120"/>
+            </w:tcMar>
+          </w:tcPr>
+          <w:p>
+            <w:r>
+              <w:t xml:space="preserve">Cambiar datos del negocio, IVA, numeración, logo e impresora.</w:t>
+            </w:r>
+          </w:p>
+        </w:tc>
+      </w:tr>
+      <w:tr>
+        <w:tc>
+          <w:tcPr>
+            <w:tcW w:type="dxa" w:w="1700"/>
+            <w:tcMar>
+              <w:top w:type="dxa" w:w="80"/>
+              <w:left w:type="dxa" w:w="120"/>
+              <w:bottom w:type="dxa" w:w="80"/>
+              <w:right w:type="dxa" w:w="120"/>
+            </w:tcMar>
+          </w:tcPr>
+          <w:p>
+            <w:r>
+              <w:t xml:space="preserve"/>
+            </w:r>
+          </w:p>
+        </w:tc>
+        <w:tc>
+          <w:tcPr>
+            <w:tcW w:type="dxa" w:w="3100"/>
+            <w:tcMar>
+              <w:top w:type="dxa" w:w="80"/>
+              <w:left w:type="dxa" w:w="120"/>
+              <w:bottom w:type="dxa" w:w="80"/>
+              <w:right w:type="dxa" w:w="120"/>
+            </w:tcMar>
+          </w:tcPr>
+          <w:p>
+            <w:r>
+              <w:t xml:space="preserve">Crear y editar usuarios</w:t>
+            </w:r>
+          </w:p>
+        </w:tc>
+        <w:tc>
+          <w:tcPr>
+            <w:tcW w:type="dxa" w:w="4600"/>
+            <w:tcMar>
+              <w:top w:type="dxa" w:w="80"/>
+              <w:left w:type="dxa" w:w="120"/>
+              <w:bottom w:type="dxa" w:w="80"/>
+              <w:right w:type="dxa" w:w="120"/>
+            </w:tcMar>
+          </w:tcPr>
+          <w:p>
+            <w:r>
+              <w:t xml:space="preserve">Gestionar usuarios y asignarles roles.</w:t>
+            </w:r>
+          </w:p>
+        </w:tc>
+      </w:tr>
+      <w:tr>
+        <w:tc>
+          <w:tcPr>
+            <w:tcW w:type="dxa" w:w="1700"/>
+            <w:tcMar>
+              <w:top w:type="dxa" w:w="80"/>
+              <w:left w:type="dxa" w:w="120"/>
+              <w:bottom w:type="dxa" w:w="80"/>
+              <w:right w:type="dxa" w:w="120"/>
+            </w:tcMar>
+          </w:tcPr>
+          <w:p>
+            <w:r>
+              <w:t xml:space="preserve"/>
+            </w:r>
+          </w:p>
+        </w:tc>
+        <w:tc>
+          <w:tcPr>
+            <w:tcW w:type="dxa" w:w="3100"/>
+            <w:tcMar>
+              <w:top w:type="dxa" w:w="80"/>
+              <w:left w:type="dxa" w:w="120"/>
+              <w:bottom w:type="dxa" w:w="80"/>
+              <w:right w:type="dxa" w:w="120"/>
+            </w:tcMar>
+          </w:tcPr>
+          <w:p>
+            <w:r>
+              <w:t xml:space="preserve">Ver el registro de auditoría</w:t>
+            </w:r>
+          </w:p>
+        </w:tc>
+        <w:tc>
+          <w:tcPr>
+            <w:tcW w:type="dxa" w:w="4600"/>
+            <w:tcMar>
+              <w:top w:type="dxa" w:w="80"/>
+              <w:left w:type="dxa" w:w="120"/>
+              <w:bottom w:type="dxa" w:w="80"/>
+              <w:right w:type="dxa" w:w="120"/>
+            </w:tcMar>
+          </w:tcPr>
+          <w:p>
+            <w:r>
+              <w:t xml:space="preserve">Entrar al módulo Auditoría.</w:t>
+            </w:r>
+          </w:p>
+        </w:tc>
+      </w:tr>
+      <w:tr>
+        <w:tc>
+          <w:tcPr>
+            <w:tcW w:type="dxa" w:w="1700"/>
+            <w:tcMar>
+              <w:top w:type="dxa" w:w="80"/>
+              <w:left w:type="dxa" w:w="120"/>
+              <w:bottom w:type="dxa" w:w="80"/>
+              <w:right w:type="dxa" w:w="120"/>
+            </w:tcMar>
+          </w:tcPr>
+          <w:p>
+            <w:r>
+              <w:t xml:space="preserve"/>
+            </w:r>
+          </w:p>
+        </w:tc>
+        <w:tc>
+          <w:tcPr>
+            <w:tcW w:type="dxa" w:w="3100"/>
+            <w:tcMar>
+              <w:top w:type="dxa" w:w="80"/>
+              <w:left w:type="dxa" w:w="120"/>
+              <w:bottom w:type="dxa" w:w="80"/>
+              <w:right w:type="dxa" w:w="120"/>
+            </w:tcMar>
+          </w:tcPr>
+          <w:p>
+            <w:r>
+              <w:t xml:space="preserve">Crear y restaurar copias de seguridad</w:t>
+            </w:r>
+          </w:p>
+        </w:tc>
+        <w:tc>
+          <w:tcPr>
+            <w:tcW w:type="dxa" w:w="4600"/>
+            <w:tcMar>
+              <w:top w:type="dxa" w:w="80"/>
+              <w:left w:type="dxa" w:w="120"/>
+              <w:bottom w:type="dxa" w:w="80"/>
+              <w:right w:type="dxa" w:w="120"/>
+            </w:tcMar>
+          </w:tcPr>
+          <w:p>
+            <w:r>
+              <w:t xml:space="preserve">Usar la pestaña Sistema para respaldos.</w:t>
+            </w:r>
+          </w:p>
+        </w:tc>
+      </w:tr>
+    </w:tbl>
+    <w:p>
+      <w:pPr>
+        <w:spacing w:after="160"/>
+      </w:pPr>
+      <w:r>
+        <w:t xml:space="preserve"/>
+      </w:r>
+    </w:p>
+    <w:p>
+      <w:pPr>
+        <w:pStyle w:val="Heading2"/>
+        <w:spacing w:after="160" w:before="320"/>
+      </w:pPr>
+      <w:r>
+        <w:t xml:space="preserve">14.4 Reglas de seguridad</w:t>
+      </w:r>
+    </w:p>
+    <w:p>
+      <w:pPr>
+        <w:pStyle w:val="ListParagraph"/>
+        <w:numPr>
+          <w:ilvl w:val="0"/>
+          <w:numId w:val="2"/>
+        </w:numPr>
+        <w:spacing w:after="80"/>
+      </w:pPr>
+      <w:r>
+        <w:rPr>
+          <w:b/>
+          <w:bCs/>
+        </w:rPr>
+        <w:t xml:space="preserve">Solo el Administrador </w:t>
+      </w:r>
+      <w:r>
+        <w:t xml:space="preserve">puede crear, editar y eliminar roles.</w:t>
+      </w:r>
+    </w:p>
+    <w:p>
+      <w:pPr>
+        <w:pStyle w:val="ListParagraph"/>
+        <w:numPr>
+          <w:ilvl w:val="0"/>
+          <w:numId w:val="2"/>
+        </w:numPr>
+        <w:spacing w:after="80"/>
+      </w:pPr>
+      <w:r>
+        <w:rPr>
+          <w:b/>
+          <w:bCs/>
+        </w:rPr>
+        <w:t xml:space="preserve">Quien gestiona usuarios sin ser Administrador </w:t>
+      </w:r>
+      <w:r>
+        <w:t xml:space="preserve">no puede asignar el rol Administrador, ni modificar cuentas de administradores, ni dar un rol con más permisos de los que él mismo tiene.</w:t>
+      </w:r>
+    </w:p>
+    <w:p>
+      <w:pPr>
+        <w:pStyle w:val="ListParagraph"/>
+        <w:numPr>
+          <w:ilvl w:val="0"/>
+          <w:numId w:val="2"/>
+        </w:numPr>
+        <w:spacing w:after="80"/>
+      </w:pPr>
+      <w:r>
+        <w:rPr>
+          <w:b/>
+          <w:bCs/>
+        </w:rPr>
+        <w:t xml:space="preserve">Nadie puede </w:t>
+      </w:r>
+      <w:r>
+        <w:t xml:space="preserve">desactivar ni eliminar su propia cuenta, ni cambiarse el rol a sí mismo; y siempre debe quedar al menos un Administrador activo.</w:t>
+      </w:r>
+    </w:p>
+    <w:p>
+      <w:pPr>
+        <w:pStyle w:val="ListParagraph"/>
+        <w:numPr>
+          <w:ilvl w:val="0"/>
+          <w:numId w:val="2"/>
+        </w:numPr>
+        <w:spacing w:after="80"/>
+      </w:pPr>
+      <w:r>
+        <w:rPr>
+          <w:b/>
+          <w:bCs/>
+        </w:rPr>
+        <w:t xml:space="preserve">Los permisos se validan dentro de la aplicación </w:t>
+      </w:r>
+      <w:r>
+        <w:t xml:space="preserve">en cada operación, no solo ocultando botones y menús.</w:t>
+      </w:r>
+    </w:p>
+    <w:p>
+      <w:pPr>
+        <w:pStyle w:val="ListParagraph"/>
+        <w:numPr>
+          <w:ilvl w:val="0"/>
+          <w:numId w:val="2"/>
+        </w:numPr>
+        <w:spacing w:after="80"/>
+      </w:pPr>
+      <w:r>
+        <w:rPr>
+          <w:b/>
+          <w:bCs/>
+        </w:rPr>
+        <w:t xml:space="preserve">Todo queda registrado: </w:t>
+      </w:r>
+      <w:r>
+        <w:t xml:space="preserve">los cambios de roles y usuarios aparecen en la Auditoría, y toda venta queda asociada al usuario que inició sesión en ese momento.</w:t>
+      </w:r>
+    </w:p>
+    <w:p>
+      <w:pPr>
+        <w:spacing w:after="160"/>
+      </w:pPr>
+      <w:r>
+        <w:t xml:space="preserve">El rol de cada usuario se asigna al crearlo o editarlo desde Configuración → Usuarios (sección 12.2).</w:t>
       </w:r>
     </w:p>
     <w:p>
@@ -3212,7 +4913,7 @@
         <w:spacing w:after="160"/>
       </w:pPr>
       <w:r>
-        <w:t xml:space="preserve">Pide a un usuario con rol Administrador que ingrese a Configuración → Usuarios, edite tu usuario y te asigne una contraseña nueva.</w:t>
+        <w:t xml:space="preserve">Pide a un usuario con permiso para gestionar usuarios (por ejemplo, el Administrador) que ingrese a Configuración → Usuarios, edite tu usuario y te asigne una contraseña nueva.</w:t>
       </w:r>
     </w:p>
     <w:p>
@@ -3246,7 +4947,7 @@
         <w:spacing w:after="160"/>
       </w:pPr>
       <w:r>
-        <w:t xml:space="preserve">Ve a Facturas, busca la venta y usa el ícono de eliminar: la venta y su factura se eliminan y el stock de los productos se devuelve automáticamente. Luego puedes registrar la venta correcta desde el módulo Ventas.</w:t>
+        <w:t xml:space="preserve">Ve a Facturas, busca la factura y usa el ícono de anular. La factura queda marcada como "Anulada", conserva su número y el stock de los productos se devuelve automáticamente. Luego puedes registrar la venta correcta desde el módulo Ventas. Si no ves el ícono, tu rol no tiene permiso para anular ventas: pide a un administrador que lo haga.</w:t>
       </w:r>
     </w:p>
     <w:p>
@@ -3255,15 +4956,15 @@
         <w:spacing w:after="160" w:before="320"/>
       </w:pPr>
       <w:r>
-        <w:t xml:space="preserve">¿Por qué no puedo ver Auditoría o la pestaña Usuarios de Configuración?</w:t>
-      </w:r>
-    </w:p>
-    <w:p>
-      <w:pPr>
-        <w:spacing w:after="160"/>
-      </w:pPr>
-      <w:r>
-        <w:t xml:space="preserve">Esas secciones solo son visibles para usuarios con rol Administrador (ver capítulo 14). Si necesitas acceso, pide a un administrador que te asigne ese rol.</w:t>
+        <w:t xml:space="preserve">¿Por qué no puedo ver una sección o un botón?</w:t>
+      </w:r>
+    </w:p>
+    <w:p>
+      <w:pPr>
+        <w:spacing w:after="160"/>
+      </w:pPr>
+      <w:r>
+        <w:t xml:space="preserve">Cada rol tiene permisos distintos: NovaPOS solo muestra las secciones y botones que tu rol permite (ver capítulo 14). Si necesitas acceso, pide a un administrador que ajuste tu rol o te asigne otro.</w:t>
       </w:r>
     </w:p>
     <w:p>
@@ -3272,15 +4973,15 @@
         <w:spacing w:after="160" w:before="320"/>
       </w:pPr>
       <w:r>
-        <w:t xml:space="preserve">Un producto no aparece o no me deja venderlo</w:t>
-      </w:r>
-    </w:p>
-    <w:p>
-      <w:pPr>
-        <w:spacing w:after="160"/>
-      </w:pPr>
-      <w:r>
-        <w:t xml:space="preserve">Revisa en Productos que el producto esté activo y tenga stock disponible; los productos desactivados o sin stock no se pueden vender.</w:t>
+        <w:t xml:space="preserve">¿Cómo creo un usuario que solo pueda vender?</w:t>
+      </w:r>
+    </w:p>
+    <w:p>
+      <w:pPr>
+        <w:spacing w:after="160"/>
+      </w:pPr>
+      <w:r>
+        <w:t xml:space="preserve">Ve a Configuración → Roles y usa el rol Vendedor o crea uno nuevo con el permiso "Registrar ventas". Luego, en Configuración → Usuarios, crea el usuario y asígnale ese rol.</w:t>
       </w:r>
     </w:p>
     <w:p>
@@ -3289,15 +4990,15 @@
         <w:spacing w:after="160" w:before="320"/>
       </w:pPr>
       <w:r>
-        <w:t xml:space="preserve">¿Cómo recupero información si algo salió mal?</w:t>
-      </w:r>
-    </w:p>
-    <w:p>
-      <w:pPr>
-        <w:spacing w:after="160"/>
-      </w:pPr>
-      <w:r>
-        <w:t xml:space="preserve">Ve a Configuración → Sistema y restaura el respaldo (backup) más reciente anterior al problema (ver sección 12.3). Recuerda reiniciar la aplicación después de restaurar.</w:t>
+        <w:t xml:space="preserve">Un vendedor no puede cambiar el precio de un producto, ¿es un error?</w:t>
+      </w:r>
+    </w:p>
+    <w:p>
+      <w:pPr>
+        <w:spacing w:after="160"/>
+      </w:pPr>
+      <w:r>
+        <w:t xml:space="preserve">No. Cambiar precios y stock es un permiso aparte ("Cambiar precios y stock al editar un producto"). Si quieres que un rol pueda hacerlo, márcalo en Configuración → Roles.</w:t>
       </w:r>
     </w:p>
     <w:p>
@@ -3306,6 +5007,74 @@
         <w:spacing w:after="160" w:before="320"/>
       </w:pPr>
       <w:r>
+        <w:t xml:space="preserve">Al vender me dice que el precio cambió o no es válido</w:t>
+      </w:r>
+    </w:p>
+    <w:p>
+      <w:pPr>
+        <w:spacing w:after="160"/>
+      </w:pPr>
+      <w:r>
+        <w:t xml:space="preserve">Significa que el precio del producto se modificó después de agregarlo al carrito. Quítalo del carrito, vuelve a agregarlo y confirma la venta de nuevo.</w:t>
+      </w:r>
+    </w:p>
+    <w:p>
+      <w:pPr>
+        <w:pStyle w:val="Heading2"/>
+        <w:spacing w:after="160" w:before="320"/>
+      </w:pPr>
+      <w:r>
+        <w:t xml:space="preserve">Intenté entrar varias veces y no me deja</w:t>
+      </w:r>
+    </w:p>
+    <w:p>
+      <w:pPr>
+        <w:spacing w:after="160"/>
+      </w:pPr>
+      <w:r>
+        <w:t xml:space="preserve">Después de 5 intentos fallidos con el mismo usuario, el acceso se bloquea durante 5 minutos. Espera y vuelve a intentarlo con la contraseña correcta; si la olvidaste, pide a un administrador que te asigne una nueva.</w:t>
+      </w:r>
+    </w:p>
+    <w:p>
+      <w:pPr>
+        <w:pStyle w:val="Heading2"/>
+        <w:spacing w:after="160" w:before="320"/>
+      </w:pPr>
+      <w:r>
+        <w:t xml:space="preserve">Un producto no aparece o no me deja venderlo</w:t>
+      </w:r>
+    </w:p>
+    <w:p>
+      <w:pPr>
+        <w:spacing w:after="160"/>
+      </w:pPr>
+      <w:r>
+        <w:t xml:space="preserve">Revisa en Productos que el producto esté activo y tenga stock disponible; los productos desactivados o sin stock no se pueden vender.</w:t>
+      </w:r>
+    </w:p>
+    <w:p>
+      <w:pPr>
+        <w:pStyle w:val="Heading2"/>
+        <w:spacing w:after="160" w:before="320"/>
+      </w:pPr>
+      <w:r>
+        <w:t xml:space="preserve">¿Cómo recupero información si algo salió mal?</w:t>
+      </w:r>
+    </w:p>
+    <w:p>
+      <w:pPr>
+        <w:spacing w:after="160"/>
+      </w:pPr>
+      <w:r>
+        <w:t xml:space="preserve">Ve a Configuración → Sistema y restaura el respaldo (backup) más reciente anterior al problema (ver sección 12.3). Recuerda reiniciar la aplicación después de restaurar.</w:t>
+      </w:r>
+    </w:p>
+    <w:p>
+      <w:pPr>
+        <w:pStyle w:val="Heading2"/>
+        <w:spacing w:after="160" w:before="320"/>
+      </w:pPr>
+      <w:r>
         <w:t xml:space="preserve">¿Puedo imprimir sin que aparezca el cuadro de diálogo de impresión?</w:t>
       </w:r>
     </w:p>
@@ -3340,6 +5109,26 @@
           <w:b/>
           <w:bCs/>
         </w:rPr>
+        <w:t xml:space="preserve">Anular: </w:t>
+      </w:r>
+      <w:r>
+        <w:t xml:space="preserve">marcar una factura como inválida conservando su número y devolver el stock; es distinto de borrarla.</w:t>
+      </w:r>
+    </w:p>
+    <w:p>
+      <w:pPr>
+        <w:pStyle w:val="ListParagraph"/>
+        <w:numPr>
+          <w:ilvl w:val="0"/>
+          <w:numId w:val="2"/>
+        </w:numPr>
+        <w:spacing w:after="80"/>
+      </w:pPr>
+      <w:r>
+        <w:rPr>
+          <w:b/>
+          <w:bCs/>
+        </w:rPr>
         <w:t xml:space="preserve">Backup: </w:t>
       </w:r>
       <w:r>
@@ -3400,10 +5189,30 @@
           <w:b/>
           <w:bCs/>
         </w:rPr>
+        <w:t xml:space="preserve">Permiso: </w:t>
+      </w:r>
+      <w:r>
+        <w:t xml:space="preserve">autorización concreta dentro de un rol, como registrar ventas o cambiar precios.</w:t>
+      </w:r>
+    </w:p>
+    <w:p>
+      <w:pPr>
+        <w:pStyle w:val="ListParagraph"/>
+        <w:numPr>
+          <w:ilvl w:val="0"/>
+          <w:numId w:val="2"/>
+        </w:numPr>
+        <w:spacing w:after="80"/>
+      </w:pPr>
+      <w:r>
+        <w:rPr>
+          <w:b/>
+          <w:bCs/>
+        </w:rPr>
         <w:t xml:space="preserve">Rol: </w:t>
       </w:r>
       <w:r>
-        <w:t xml:space="preserve">conjunto de permisos que determina qué secciones puede ver y usar un usuario (Administrador o Vendedor).</w:t>
+        <w:t xml:space="preserve">conjunto de permisos que determina qué puede ver y hacer un usuario. NovaPOS trae los roles Administrador y Vendedor y permite crear más.</w:t>
       </w:r>
     </w:p>
     <w:p>

</xml_diff>